<commit_message>
check: publish pending verdict
</commit_message>
<xml_diff>
--- a/projects/English.docx
+++ b/projects/English.docx
@@ -48,10 +48,24 @@
           <w:rFonts w:hint="eastAsia"/>
           <w:lang w:val="en-US" w:eastAsia="zh-CN"/>
         </w:rPr>
-        <w:t>促进Aβ聚集有神经毒性的肽 2-3条</w:t>
+        <w:t xml:space="preserve">促进Aβ聚集 </w:t>
       </w:r>
       <w:bookmarkStart w:id="0" w:name="_GoBack"/>
+      <w:r>
+        <w:rPr>
+          <w:rFonts w:hint="eastAsia"/>
+          <w:lang w:val="en-US" w:eastAsia="zh-CN"/>
+        </w:rPr>
+        <w:t>有神经毒性的肽</w:t>
+      </w:r>
       <w:bookmarkEnd w:id="0"/>
+      <w:r>
+        <w:rPr>
+          <w:rFonts w:hint="eastAsia"/>
+          <w:lang w:val="en-US" w:eastAsia="zh-CN"/>
+        </w:rPr>
+        <w:t xml:space="preserve"> 2-3条pc12</w:t>
+      </w:r>
     </w:p>
     <w:p>
       <w:pPr>
@@ -1067,12 +1081,6 @@
             <w:insideH w:val="none" w:color="auto" w:sz="0" w:space="0"/>
             <w:insideV w:val="none" w:color="auto" w:sz="0" w:space="0"/>
           </w:tblBorders>
-          <w:tblCellMar>
-            <w:top w:w="70" w:type="dxa"/>
-            <w:left w:w="80" w:type="dxa"/>
-            <w:bottom w:w="70" w:type="dxa"/>
-            <w:right w:w="80" w:type="dxa"/>
-          </w:tblCellMar>
         </w:tblPrEx>
         <w:trPr>
           <w:tblHeader/>
@@ -2116,6 +2124,12 @@
             <w:insideH w:val="none" w:color="auto" w:sz="0" w:space="0"/>
             <w:insideV w:val="none" w:color="auto" w:sz="0" w:space="0"/>
           </w:tblBorders>
+          <w:tblCellMar>
+            <w:top w:w="70" w:type="dxa"/>
+            <w:left w:w="80" w:type="dxa"/>
+            <w:bottom w:w="70" w:type="dxa"/>
+            <w:right w:w="80" w:type="dxa"/>
+          </w:tblCellMar>
         </w:tblPrEx>
         <w:tc>
           <w:tcPr>
@@ -2674,6 +2688,12 @@
             <w:insideH w:val="none" w:color="auto" w:sz="0" w:space="0"/>
             <w:insideV w:val="none" w:color="auto" w:sz="0" w:space="0"/>
           </w:tblBorders>
+          <w:tblCellMar>
+            <w:top w:w="70" w:type="dxa"/>
+            <w:left w:w="80" w:type="dxa"/>
+            <w:bottom w:w="70" w:type="dxa"/>
+            <w:right w:w="80" w:type="dxa"/>
+          </w:tblCellMar>
         </w:tblPrEx>
         <w:tc>
           <w:tcPr>

</xml_diff>

<commit_message>
local: auto 20261012-103323 (1 file(s))
</commit_message>
<xml_diff>
--- a/projects/English.docx
+++ b/projects/English.docx
@@ -48,23 +48,16 @@
           <w:rFonts w:hint="eastAsia"/>
           <w:lang w:val="en-US" w:eastAsia="zh-CN"/>
         </w:rPr>
-        <w:t xml:space="preserve">促进Aβ聚集 </w:t>
+        <w:t>促进Aβ聚集的模型</w:t>
       </w:r>
       <w:bookmarkStart w:id="0" w:name="_GoBack"/>
+      <w:bookmarkEnd w:id="0"/>
       <w:r>
         <w:rPr>
           <w:rFonts w:hint="eastAsia"/>
           <w:lang w:val="en-US" w:eastAsia="zh-CN"/>
         </w:rPr>
-        <w:t>有神经毒性的肽</w:t>
-      </w:r>
-      <w:bookmarkEnd w:id="0"/>
-      <w:r>
-        <w:rPr>
-          <w:rFonts w:hint="eastAsia"/>
-          <w:lang w:val="en-US" w:eastAsia="zh-CN"/>
-        </w:rPr>
-        <w:t xml:space="preserve"> 2-3条pc12</w:t>
+        <w:t xml:space="preserve"> 有神经毒性的肽 2-3条pc12</w:t>
       </w:r>
     </w:p>
     <w:p>
@@ -1081,6 +1074,12 @@
             <w:insideH w:val="none" w:color="auto" w:sz="0" w:space="0"/>
             <w:insideV w:val="none" w:color="auto" w:sz="0" w:space="0"/>
           </w:tblBorders>
+          <w:tblCellMar>
+            <w:top w:w="70" w:type="dxa"/>
+            <w:left w:w="80" w:type="dxa"/>
+            <w:bottom w:w="70" w:type="dxa"/>
+            <w:right w:w="80" w:type="dxa"/>
+          </w:tblCellMar>
         </w:tblPrEx>
         <w:trPr>
           <w:tblHeader/>

</xml_diff>

<commit_message>
local: auto 20261013-154941 (1 file(s))
</commit_message>
<xml_diff>
--- a/projects/English.docx
+++ b/projects/English.docx
@@ -44,12 +44,13 @@
         <w:t>Deep-learning screening, molecular docking and molecular dynamics of periodontitis oral micropeptides targeting human acetylcholinesterase</w:t>
       </w:r>
       <w:bookmarkStart w:id="0" w:name="_GoBack"/>
+      <w:bookmarkEnd w:id="0"/>
       <w:r>
         <w:rPr>
           <w:rFonts w:hint="eastAsia"/>
           <w:lang w:val="en-US" w:eastAsia="zh-CN"/>
         </w:rPr>
-        <w:t>导师让加实验</w:t>
+        <w:t>加实验</w:t>
       </w:r>
       <w:r>
         <w:rPr>
@@ -112,7 +113,6 @@
         <w:t>Aβ聚集实验 神经毒性的肽pc12</w:t>
       </w:r>
     </w:p>
-    <w:bookmarkEnd w:id="0"/>
     <w:p>
       <w:pPr>
         <w:pStyle w:val="3"/>
@@ -1424,6 +1424,12 @@
             <w:insideH w:val="none" w:color="auto" w:sz="0" w:space="0"/>
             <w:insideV w:val="none" w:color="auto" w:sz="0" w:space="0"/>
           </w:tblBorders>
+          <w:tblCellMar>
+            <w:top w:w="70" w:type="dxa"/>
+            <w:left w:w="80" w:type="dxa"/>
+            <w:bottom w:w="70" w:type="dxa"/>
+            <w:right w:w="80" w:type="dxa"/>
+          </w:tblCellMar>
         </w:tblPrEx>
         <w:tc>
           <w:tcPr>
@@ -1498,270 +1504,6 @@
                 <w:szCs w:val="20"/>
               </w:rPr>
               <w:t>15.62</w:t>
-            </w:r>
-          </w:p>
-        </w:tc>
-      </w:tr>
-      <w:tr>
-        <w:tblPrEx>
-          <w:tblBorders>
-            <w:top w:val="single" w:color="000000" w:sz="12" w:space="0"/>
-            <w:left w:val="none" w:color="auto" w:sz="0" w:space="0"/>
-            <w:bottom w:val="single" w:color="000000" w:sz="12" w:space="0"/>
-            <w:right w:val="none" w:color="auto" w:sz="0" w:space="0"/>
-            <w:insideH w:val="none" w:color="auto" w:sz="0" w:space="0"/>
-            <w:insideV w:val="none" w:color="auto" w:sz="0" w:space="0"/>
-          </w:tblBorders>
-        </w:tblPrEx>
-        <w:tc>
-          <w:tcPr>
-            <w:tcW w:w="2340" w:type="dxa"/>
-            <w:vAlign w:val="center"/>
-          </w:tcPr>
-          <w:p>
-            <w:pPr>
-              <w:pStyle w:val="15"/>
-              <w:spacing w:before="0" w:after="0" w:line="240" w:lineRule="auto"/>
-            </w:pPr>
-            <w:r>
-              <w:rPr>
-                <w:sz w:val="20"/>
-                <w:szCs w:val="20"/>
-              </w:rPr>
-              <w:t>4</w:t>
-            </w:r>
-          </w:p>
-        </w:tc>
-        <w:tc>
-          <w:tcPr>
-            <w:tcW w:w="2340" w:type="dxa"/>
-            <w:vAlign w:val="center"/>
-          </w:tcPr>
-          <w:p>
-            <w:pPr>
-              <w:pStyle w:val="15"/>
-              <w:spacing w:before="0" w:after="0" w:line="240" w:lineRule="auto"/>
-            </w:pPr>
-            <w:r>
-              <w:rPr>
-                <w:sz w:val="20"/>
-                <w:szCs w:val="20"/>
-              </w:rPr>
-              <w:t>Umami</w:t>
-            </w:r>
-          </w:p>
-        </w:tc>
-        <w:tc>
-          <w:tcPr>
-            <w:tcW w:w="2340" w:type="dxa"/>
-            <w:vAlign w:val="center"/>
-          </w:tcPr>
-          <w:p>
-            <w:pPr>
-              <w:pStyle w:val="15"/>
-              <w:spacing w:before="0" w:after="0" w:line="240" w:lineRule="auto"/>
-            </w:pPr>
-            <w:r>
-              <w:rPr>
-                <w:sz w:val="20"/>
-                <w:szCs w:val="20"/>
-              </w:rPr>
-              <w:t>3,100,811</w:t>
-            </w:r>
-          </w:p>
-        </w:tc>
-        <w:tc>
-          <w:tcPr>
-            <w:tcW w:w="2340" w:type="dxa"/>
-            <w:vAlign w:val="center"/>
-          </w:tcPr>
-          <w:p>
-            <w:pPr>
-              <w:pStyle w:val="15"/>
-              <w:spacing w:before="0" w:after="0" w:line="240" w:lineRule="auto"/>
-            </w:pPr>
-            <w:r>
-              <w:rPr>
-                <w:sz w:val="20"/>
-                <w:szCs w:val="20"/>
-              </w:rPr>
-              <w:t>26.45</w:t>
-            </w:r>
-          </w:p>
-        </w:tc>
-      </w:tr>
-      <w:tr>
-        <w:tblPrEx>
-          <w:tblBorders>
-            <w:top w:val="single" w:color="000000" w:sz="12" w:space="0"/>
-            <w:left w:val="none" w:color="auto" w:sz="0" w:space="0"/>
-            <w:bottom w:val="single" w:color="000000" w:sz="12" w:space="0"/>
-            <w:right w:val="none" w:color="auto" w:sz="0" w:space="0"/>
-            <w:insideH w:val="none" w:color="auto" w:sz="0" w:space="0"/>
-            <w:insideV w:val="none" w:color="auto" w:sz="0" w:space="0"/>
-          </w:tblBorders>
-        </w:tblPrEx>
-        <w:tc>
-          <w:tcPr>
-            <w:tcW w:w="2340" w:type="dxa"/>
-            <w:vAlign w:val="center"/>
-          </w:tcPr>
-          <w:p>
-            <w:pPr>
-              <w:pStyle w:val="15"/>
-              <w:spacing w:before="0" w:after="0" w:line="240" w:lineRule="auto"/>
-            </w:pPr>
-            <w:r>
-              <w:rPr>
-                <w:sz w:val="20"/>
-                <w:szCs w:val="20"/>
-              </w:rPr>
-              <w:t>5</w:t>
-            </w:r>
-          </w:p>
-        </w:tc>
-        <w:tc>
-          <w:tcPr>
-            <w:tcW w:w="2340" w:type="dxa"/>
-            <w:vAlign w:val="center"/>
-          </w:tcPr>
-          <w:p>
-            <w:pPr>
-              <w:pStyle w:val="15"/>
-              <w:spacing w:before="0" w:after="0" w:line="240" w:lineRule="auto"/>
-            </w:pPr>
-            <w:r>
-              <w:rPr>
-                <w:sz w:val="20"/>
-                <w:szCs w:val="20"/>
-              </w:rPr>
-              <w:t>Antimicrobial</w:t>
-            </w:r>
-          </w:p>
-        </w:tc>
-        <w:tc>
-          <w:tcPr>
-            <w:tcW w:w="2340" w:type="dxa"/>
-            <w:vAlign w:val="center"/>
-          </w:tcPr>
-          <w:p>
-            <w:pPr>
-              <w:pStyle w:val="15"/>
-              <w:spacing w:before="0" w:after="0" w:line="240" w:lineRule="auto"/>
-            </w:pPr>
-            <w:r>
-              <w:rPr>
-                <w:sz w:val="20"/>
-                <w:szCs w:val="20"/>
-              </w:rPr>
-              <w:t>10,302,093</w:t>
-            </w:r>
-          </w:p>
-        </w:tc>
-        <w:tc>
-          <w:tcPr>
-            <w:tcW w:w="2340" w:type="dxa"/>
-            <w:vAlign w:val="center"/>
-          </w:tcPr>
-          <w:p>
-            <w:pPr>
-              <w:pStyle w:val="15"/>
-              <w:spacing w:before="0" w:after="0" w:line="240" w:lineRule="auto"/>
-            </w:pPr>
-            <w:r>
-              <w:rPr>
-                <w:sz w:val="20"/>
-                <w:szCs w:val="20"/>
-              </w:rPr>
-              <w:t>87.89</w:t>
-            </w:r>
-          </w:p>
-        </w:tc>
-      </w:tr>
-      <w:tr>
-        <w:tblPrEx>
-          <w:tblBorders>
-            <w:top w:val="single" w:color="000000" w:sz="12" w:space="0"/>
-            <w:left w:val="none" w:color="auto" w:sz="0" w:space="0"/>
-            <w:bottom w:val="single" w:color="000000" w:sz="12" w:space="0"/>
-            <w:right w:val="none" w:color="auto" w:sz="0" w:space="0"/>
-            <w:insideH w:val="none" w:color="auto" w:sz="0" w:space="0"/>
-            <w:insideV w:val="none" w:color="auto" w:sz="0" w:space="0"/>
-          </w:tblBorders>
-        </w:tblPrEx>
-        <w:tc>
-          <w:tcPr>
-            <w:tcW w:w="2340" w:type="dxa"/>
-            <w:vAlign w:val="center"/>
-          </w:tcPr>
-          <w:p>
-            <w:pPr>
-              <w:pStyle w:val="15"/>
-              <w:spacing w:before="0" w:after="0" w:line="240" w:lineRule="auto"/>
-            </w:pPr>
-            <w:r>
-              <w:rPr>
-                <w:sz w:val="20"/>
-                <w:szCs w:val="20"/>
-              </w:rPr>
-              <w:t>6</w:t>
-            </w:r>
-          </w:p>
-        </w:tc>
-        <w:tc>
-          <w:tcPr>
-            <w:tcW w:w="2340" w:type="dxa"/>
-            <w:vAlign w:val="center"/>
-          </w:tcPr>
-          <w:p>
-            <w:pPr>
-              <w:pStyle w:val="15"/>
-              <w:spacing w:before="0" w:after="0" w:line="240" w:lineRule="auto"/>
-            </w:pPr>
-            <w:r>
-              <w:rPr>
-                <w:sz w:val="20"/>
-                <w:szCs w:val="20"/>
-              </w:rPr>
-              <w:t>Antimalarial (alternative)</w:t>
-            </w:r>
-          </w:p>
-        </w:tc>
-        <w:tc>
-          <w:tcPr>
-            <w:tcW w:w="2340" w:type="dxa"/>
-            <w:vAlign w:val="center"/>
-          </w:tcPr>
-          <w:p>
-            <w:pPr>
-              <w:pStyle w:val="15"/>
-              <w:spacing w:before="0" w:after="0" w:line="240" w:lineRule="auto"/>
-            </w:pPr>
-            <w:r>
-              <w:rPr>
-                <w:sz w:val="20"/>
-                <w:szCs w:val="20"/>
-              </w:rPr>
-              <w:t>695,608</w:t>
-            </w:r>
-          </w:p>
-        </w:tc>
-        <w:tc>
-          <w:tcPr>
-            <w:tcW w:w="2340" w:type="dxa"/>
-            <w:vAlign w:val="center"/>
-          </w:tcPr>
-          <w:p>
-            <w:pPr>
-              <w:pStyle w:val="15"/>
-              <w:spacing w:before="0" w:after="0" w:line="240" w:lineRule="auto"/>
-            </w:pPr>
-            <w:r>
-              <w:rPr>
-                <w:sz w:val="20"/>
-                <w:szCs w:val="20"/>
-              </w:rPr>
-              <w:t>5.93</w:t>
             </w:r>
           </w:p>
         </w:tc>
@@ -1798,64 +1540,64 @@
                 <w:sz w:val="20"/>
                 <w:szCs w:val="20"/>
               </w:rPr>
-              <w:t>7</w:t>
-            </w:r>
-          </w:p>
-        </w:tc>
-        <w:tc>
-          <w:tcPr>
-            <w:tcW w:w="2340" w:type="dxa"/>
-            <w:vAlign w:val="center"/>
-          </w:tcPr>
-          <w:p>
-            <w:pPr>
-              <w:pStyle w:val="15"/>
-              <w:spacing w:before="0" w:after="0" w:line="240" w:lineRule="auto"/>
-            </w:pPr>
-            <w:r>
-              <w:rPr>
-                <w:sz w:val="20"/>
-                <w:szCs w:val="20"/>
-              </w:rPr>
-              <w:t>Antimalarial (main)</w:t>
-            </w:r>
-          </w:p>
-        </w:tc>
-        <w:tc>
-          <w:tcPr>
-            <w:tcW w:w="2340" w:type="dxa"/>
-            <w:vAlign w:val="center"/>
-          </w:tcPr>
-          <w:p>
-            <w:pPr>
-              <w:pStyle w:val="15"/>
-              <w:spacing w:before="0" w:after="0" w:line="240" w:lineRule="auto"/>
-            </w:pPr>
-            <w:r>
-              <w:rPr>
-                <w:sz w:val="20"/>
-                <w:szCs w:val="20"/>
-              </w:rPr>
-              <w:t>2,010,724</w:t>
-            </w:r>
-          </w:p>
-        </w:tc>
-        <w:tc>
-          <w:tcPr>
-            <w:tcW w:w="2340" w:type="dxa"/>
-            <w:vAlign w:val="center"/>
-          </w:tcPr>
-          <w:p>
-            <w:pPr>
-              <w:pStyle w:val="15"/>
-              <w:spacing w:before="0" w:after="0" w:line="240" w:lineRule="auto"/>
-            </w:pPr>
-            <w:r>
-              <w:rPr>
-                <w:sz w:val="20"/>
-                <w:szCs w:val="20"/>
-              </w:rPr>
-              <w:t>17.15</w:t>
+              <w:t>4</w:t>
+            </w:r>
+          </w:p>
+        </w:tc>
+        <w:tc>
+          <w:tcPr>
+            <w:tcW w:w="2340" w:type="dxa"/>
+            <w:vAlign w:val="center"/>
+          </w:tcPr>
+          <w:p>
+            <w:pPr>
+              <w:pStyle w:val="15"/>
+              <w:spacing w:before="0" w:after="0" w:line="240" w:lineRule="auto"/>
+            </w:pPr>
+            <w:r>
+              <w:rPr>
+                <w:sz w:val="20"/>
+                <w:szCs w:val="20"/>
+              </w:rPr>
+              <w:t>Umami</w:t>
+            </w:r>
+          </w:p>
+        </w:tc>
+        <w:tc>
+          <w:tcPr>
+            <w:tcW w:w="2340" w:type="dxa"/>
+            <w:vAlign w:val="center"/>
+          </w:tcPr>
+          <w:p>
+            <w:pPr>
+              <w:pStyle w:val="15"/>
+              <w:spacing w:before="0" w:after="0" w:line="240" w:lineRule="auto"/>
+            </w:pPr>
+            <w:r>
+              <w:rPr>
+                <w:sz w:val="20"/>
+                <w:szCs w:val="20"/>
+              </w:rPr>
+              <w:t>3,100,811</w:t>
+            </w:r>
+          </w:p>
+        </w:tc>
+        <w:tc>
+          <w:tcPr>
+            <w:tcW w:w="2340" w:type="dxa"/>
+            <w:vAlign w:val="center"/>
+          </w:tcPr>
+          <w:p>
+            <w:pPr>
+              <w:pStyle w:val="15"/>
+              <w:spacing w:before="0" w:after="0" w:line="240" w:lineRule="auto"/>
+            </w:pPr>
+            <w:r>
+              <w:rPr>
+                <w:sz w:val="20"/>
+                <w:szCs w:val="20"/>
+              </w:rPr>
+              <w:t>26.45</w:t>
             </w:r>
           </w:p>
         </w:tc>
@@ -1892,64 +1634,64 @@
                 <w:sz w:val="20"/>
                 <w:szCs w:val="20"/>
               </w:rPr>
-              <w:t>8</w:t>
-            </w:r>
-          </w:p>
-        </w:tc>
-        <w:tc>
-          <w:tcPr>
-            <w:tcW w:w="2340" w:type="dxa"/>
-            <w:vAlign w:val="center"/>
-          </w:tcPr>
-          <w:p>
-            <w:pPr>
-              <w:pStyle w:val="15"/>
-              <w:spacing w:before="0" w:after="0" w:line="240" w:lineRule="auto"/>
-            </w:pPr>
-            <w:r>
-              <w:rPr>
-                <w:sz w:val="20"/>
-                <w:szCs w:val="20"/>
-              </w:rPr>
-              <w:t>Quorum sensing</w:t>
-            </w:r>
-          </w:p>
-        </w:tc>
-        <w:tc>
-          <w:tcPr>
-            <w:tcW w:w="2340" w:type="dxa"/>
-            <w:vAlign w:val="center"/>
-          </w:tcPr>
-          <w:p>
-            <w:pPr>
-              <w:pStyle w:val="15"/>
-              <w:spacing w:before="0" w:after="0" w:line="240" w:lineRule="auto"/>
-            </w:pPr>
-            <w:r>
-              <w:rPr>
-                <w:sz w:val="20"/>
-                <w:szCs w:val="20"/>
-              </w:rPr>
-              <w:t>4,491,507</w:t>
-            </w:r>
-          </w:p>
-        </w:tc>
-        <w:tc>
-          <w:tcPr>
-            <w:tcW w:w="2340" w:type="dxa"/>
-            <w:vAlign w:val="center"/>
-          </w:tcPr>
-          <w:p>
-            <w:pPr>
-              <w:pStyle w:val="15"/>
-              <w:spacing w:before="0" w:after="0" w:line="240" w:lineRule="auto"/>
-            </w:pPr>
-            <w:r>
-              <w:rPr>
-                <w:sz w:val="20"/>
-                <w:szCs w:val="20"/>
-              </w:rPr>
-              <w:t>38.32</w:t>
+              <w:t>5</w:t>
+            </w:r>
+          </w:p>
+        </w:tc>
+        <w:tc>
+          <w:tcPr>
+            <w:tcW w:w="2340" w:type="dxa"/>
+            <w:vAlign w:val="center"/>
+          </w:tcPr>
+          <w:p>
+            <w:pPr>
+              <w:pStyle w:val="15"/>
+              <w:spacing w:before="0" w:after="0" w:line="240" w:lineRule="auto"/>
+            </w:pPr>
+            <w:r>
+              <w:rPr>
+                <w:sz w:val="20"/>
+                <w:szCs w:val="20"/>
+              </w:rPr>
+              <w:t>Antimicrobial</w:t>
+            </w:r>
+          </w:p>
+        </w:tc>
+        <w:tc>
+          <w:tcPr>
+            <w:tcW w:w="2340" w:type="dxa"/>
+            <w:vAlign w:val="center"/>
+          </w:tcPr>
+          <w:p>
+            <w:pPr>
+              <w:pStyle w:val="15"/>
+              <w:spacing w:before="0" w:after="0" w:line="240" w:lineRule="auto"/>
+            </w:pPr>
+            <w:r>
+              <w:rPr>
+                <w:sz w:val="20"/>
+                <w:szCs w:val="20"/>
+              </w:rPr>
+              <w:t>10,302,093</w:t>
+            </w:r>
+          </w:p>
+        </w:tc>
+        <w:tc>
+          <w:tcPr>
+            <w:tcW w:w="2340" w:type="dxa"/>
+            <w:vAlign w:val="center"/>
+          </w:tcPr>
+          <w:p>
+            <w:pPr>
+              <w:pStyle w:val="15"/>
+              <w:spacing w:before="0" w:after="0" w:line="240" w:lineRule="auto"/>
+            </w:pPr>
+            <w:r>
+              <w:rPr>
+                <w:sz w:val="20"/>
+                <w:szCs w:val="20"/>
+              </w:rPr>
+              <w:t>87.89</w:t>
             </w:r>
           </w:p>
         </w:tc>
@@ -1986,64 +1728,64 @@
                 <w:sz w:val="20"/>
                 <w:szCs w:val="20"/>
               </w:rPr>
-              <w:t>9</w:t>
-            </w:r>
-          </w:p>
-        </w:tc>
-        <w:tc>
-          <w:tcPr>
-            <w:tcW w:w="2340" w:type="dxa"/>
-            <w:vAlign w:val="center"/>
-          </w:tcPr>
-          <w:p>
-            <w:pPr>
-              <w:pStyle w:val="15"/>
-              <w:spacing w:before="0" w:after="0" w:line="240" w:lineRule="auto"/>
-            </w:pPr>
-            <w:r>
-              <w:rPr>
-                <w:sz w:val="20"/>
-                <w:szCs w:val="20"/>
-              </w:rPr>
-              <w:t>Anticancer (main)</w:t>
-            </w:r>
-          </w:p>
-        </w:tc>
-        <w:tc>
-          <w:tcPr>
-            <w:tcW w:w="2340" w:type="dxa"/>
-            <w:vAlign w:val="center"/>
-          </w:tcPr>
-          <w:p>
-            <w:pPr>
-              <w:pStyle w:val="15"/>
-              <w:spacing w:before="0" w:after="0" w:line="240" w:lineRule="auto"/>
-            </w:pPr>
-            <w:r>
-              <w:rPr>
-                <w:sz w:val="20"/>
-                <w:szCs w:val="20"/>
-              </w:rPr>
-              <w:t>2,357,718</w:t>
-            </w:r>
-          </w:p>
-        </w:tc>
-        <w:tc>
-          <w:tcPr>
-            <w:tcW w:w="2340" w:type="dxa"/>
-            <w:vAlign w:val="center"/>
-          </w:tcPr>
-          <w:p>
-            <w:pPr>
-              <w:pStyle w:val="15"/>
-              <w:spacing w:before="0" w:after="0" w:line="240" w:lineRule="auto"/>
-            </w:pPr>
-            <w:r>
-              <w:rPr>
-                <w:sz w:val="20"/>
-                <w:szCs w:val="20"/>
-              </w:rPr>
-              <w:t>20.11</w:t>
+              <w:t>6</w:t>
+            </w:r>
+          </w:p>
+        </w:tc>
+        <w:tc>
+          <w:tcPr>
+            <w:tcW w:w="2340" w:type="dxa"/>
+            <w:vAlign w:val="center"/>
+          </w:tcPr>
+          <w:p>
+            <w:pPr>
+              <w:pStyle w:val="15"/>
+              <w:spacing w:before="0" w:after="0" w:line="240" w:lineRule="auto"/>
+            </w:pPr>
+            <w:r>
+              <w:rPr>
+                <w:sz w:val="20"/>
+                <w:szCs w:val="20"/>
+              </w:rPr>
+              <w:t>Antimalarial (alternative)</w:t>
+            </w:r>
+          </w:p>
+        </w:tc>
+        <w:tc>
+          <w:tcPr>
+            <w:tcW w:w="2340" w:type="dxa"/>
+            <w:vAlign w:val="center"/>
+          </w:tcPr>
+          <w:p>
+            <w:pPr>
+              <w:pStyle w:val="15"/>
+              <w:spacing w:before="0" w:after="0" w:line="240" w:lineRule="auto"/>
+            </w:pPr>
+            <w:r>
+              <w:rPr>
+                <w:sz w:val="20"/>
+                <w:szCs w:val="20"/>
+              </w:rPr>
+              <w:t>695,608</w:t>
+            </w:r>
+          </w:p>
+        </w:tc>
+        <w:tc>
+          <w:tcPr>
+            <w:tcW w:w="2340" w:type="dxa"/>
+            <w:vAlign w:val="center"/>
+          </w:tcPr>
+          <w:p>
+            <w:pPr>
+              <w:pStyle w:val="15"/>
+              <w:spacing w:before="0" w:after="0" w:line="240" w:lineRule="auto"/>
+            </w:pPr>
+            <w:r>
+              <w:rPr>
+                <w:sz w:val="20"/>
+                <w:szCs w:val="20"/>
+              </w:rPr>
+              <w:t>5.93</w:t>
             </w:r>
           </w:p>
         </w:tc>
@@ -2080,64 +1822,64 @@
                 <w:sz w:val="20"/>
                 <w:szCs w:val="20"/>
               </w:rPr>
-              <w:t>10</w:t>
-            </w:r>
-          </w:p>
-        </w:tc>
-        <w:tc>
-          <w:tcPr>
-            <w:tcW w:w="2340" w:type="dxa"/>
-            <w:vAlign w:val="center"/>
-          </w:tcPr>
-          <w:p>
-            <w:pPr>
-              <w:pStyle w:val="15"/>
-              <w:spacing w:before="0" w:after="0" w:line="240" w:lineRule="auto"/>
-            </w:pPr>
-            <w:r>
-              <w:rPr>
-                <w:sz w:val="20"/>
-                <w:szCs w:val="20"/>
-              </w:rPr>
-              <w:t>Anticancer (alternative)</w:t>
-            </w:r>
-          </w:p>
-        </w:tc>
-        <w:tc>
-          <w:tcPr>
-            <w:tcW w:w="2340" w:type="dxa"/>
-            <w:vAlign w:val="center"/>
-          </w:tcPr>
-          <w:p>
-            <w:pPr>
-              <w:pStyle w:val="15"/>
-              <w:spacing w:before="0" w:after="0" w:line="240" w:lineRule="auto"/>
-            </w:pPr>
-            <w:r>
-              <w:rPr>
-                <w:sz w:val="20"/>
-                <w:szCs w:val="20"/>
-              </w:rPr>
-              <w:t>2,015,652</w:t>
-            </w:r>
-          </w:p>
-        </w:tc>
-        <w:tc>
-          <w:tcPr>
-            <w:tcW w:w="2340" w:type="dxa"/>
-            <w:vAlign w:val="center"/>
-          </w:tcPr>
-          <w:p>
-            <w:pPr>
-              <w:pStyle w:val="15"/>
-              <w:spacing w:before="0" w:after="0" w:line="240" w:lineRule="auto"/>
-            </w:pPr>
-            <w:r>
-              <w:rPr>
-                <w:sz w:val="20"/>
-                <w:szCs w:val="20"/>
-              </w:rPr>
-              <w:t>17.20</w:t>
+              <w:t>7</w:t>
+            </w:r>
+          </w:p>
+        </w:tc>
+        <w:tc>
+          <w:tcPr>
+            <w:tcW w:w="2340" w:type="dxa"/>
+            <w:vAlign w:val="center"/>
+          </w:tcPr>
+          <w:p>
+            <w:pPr>
+              <w:pStyle w:val="15"/>
+              <w:spacing w:before="0" w:after="0" w:line="240" w:lineRule="auto"/>
+            </w:pPr>
+            <w:r>
+              <w:rPr>
+                <w:sz w:val="20"/>
+                <w:szCs w:val="20"/>
+              </w:rPr>
+              <w:t>Antimalarial (main)</w:t>
+            </w:r>
+          </w:p>
+        </w:tc>
+        <w:tc>
+          <w:tcPr>
+            <w:tcW w:w="2340" w:type="dxa"/>
+            <w:vAlign w:val="center"/>
+          </w:tcPr>
+          <w:p>
+            <w:pPr>
+              <w:pStyle w:val="15"/>
+              <w:spacing w:before="0" w:after="0" w:line="240" w:lineRule="auto"/>
+            </w:pPr>
+            <w:r>
+              <w:rPr>
+                <w:sz w:val="20"/>
+                <w:szCs w:val="20"/>
+              </w:rPr>
+              <w:t>2,010,724</w:t>
+            </w:r>
+          </w:p>
+        </w:tc>
+        <w:tc>
+          <w:tcPr>
+            <w:tcW w:w="2340" w:type="dxa"/>
+            <w:vAlign w:val="center"/>
+          </w:tcPr>
+          <w:p>
+            <w:pPr>
+              <w:pStyle w:val="15"/>
+              <w:spacing w:before="0" w:after="0" w:line="240" w:lineRule="auto"/>
+            </w:pPr>
+            <w:r>
+              <w:rPr>
+                <w:sz w:val="20"/>
+                <w:szCs w:val="20"/>
+              </w:rPr>
+              <w:t>17.15</w:t>
             </w:r>
           </w:p>
         </w:tc>
@@ -2174,64 +1916,64 @@
                 <w:sz w:val="20"/>
                 <w:szCs w:val="20"/>
               </w:rPr>
-              <w:t>11</w:t>
-            </w:r>
-          </w:p>
-        </w:tc>
-        <w:tc>
-          <w:tcPr>
-            <w:tcW w:w="2340" w:type="dxa"/>
-            <w:vAlign w:val="center"/>
-          </w:tcPr>
-          <w:p>
-            <w:pPr>
-              <w:pStyle w:val="15"/>
-              <w:spacing w:before="0" w:after="0" w:line="240" w:lineRule="auto"/>
-            </w:pPr>
-            <w:r>
-              <w:rPr>
-                <w:sz w:val="20"/>
-                <w:szCs w:val="20"/>
-              </w:rPr>
-              <w:t>Anti-MRSA</w:t>
-            </w:r>
-          </w:p>
-        </w:tc>
-        <w:tc>
-          <w:tcPr>
-            <w:tcW w:w="2340" w:type="dxa"/>
-            <w:vAlign w:val="center"/>
-          </w:tcPr>
-          <w:p>
-            <w:pPr>
-              <w:pStyle w:val="15"/>
-              <w:spacing w:before="0" w:after="0" w:line="240" w:lineRule="auto"/>
-            </w:pPr>
-            <w:r>
-              <w:rPr>
-                <w:sz w:val="20"/>
-                <w:szCs w:val="20"/>
-              </w:rPr>
-              <w:t>843,977</w:t>
-            </w:r>
-          </w:p>
-        </w:tc>
-        <w:tc>
-          <w:tcPr>
-            <w:tcW w:w="2340" w:type="dxa"/>
-            <w:vAlign w:val="center"/>
-          </w:tcPr>
-          <w:p>
-            <w:pPr>
-              <w:pStyle w:val="15"/>
-              <w:spacing w:before="0" w:after="0" w:line="240" w:lineRule="auto"/>
-            </w:pPr>
-            <w:r>
-              <w:rPr>
-                <w:sz w:val="20"/>
-                <w:szCs w:val="20"/>
-              </w:rPr>
-              <w:t>7.20</w:t>
+              <w:t>8</w:t>
+            </w:r>
+          </w:p>
+        </w:tc>
+        <w:tc>
+          <w:tcPr>
+            <w:tcW w:w="2340" w:type="dxa"/>
+            <w:vAlign w:val="center"/>
+          </w:tcPr>
+          <w:p>
+            <w:pPr>
+              <w:pStyle w:val="15"/>
+              <w:spacing w:before="0" w:after="0" w:line="240" w:lineRule="auto"/>
+            </w:pPr>
+            <w:r>
+              <w:rPr>
+                <w:sz w:val="20"/>
+                <w:szCs w:val="20"/>
+              </w:rPr>
+              <w:t>Quorum sensing</w:t>
+            </w:r>
+          </w:p>
+        </w:tc>
+        <w:tc>
+          <w:tcPr>
+            <w:tcW w:w="2340" w:type="dxa"/>
+            <w:vAlign w:val="center"/>
+          </w:tcPr>
+          <w:p>
+            <w:pPr>
+              <w:pStyle w:val="15"/>
+              <w:spacing w:before="0" w:after="0" w:line="240" w:lineRule="auto"/>
+            </w:pPr>
+            <w:r>
+              <w:rPr>
+                <w:sz w:val="20"/>
+                <w:szCs w:val="20"/>
+              </w:rPr>
+              <w:t>4,491,507</w:t>
+            </w:r>
+          </w:p>
+        </w:tc>
+        <w:tc>
+          <w:tcPr>
+            <w:tcW w:w="2340" w:type="dxa"/>
+            <w:vAlign w:val="center"/>
+          </w:tcPr>
+          <w:p>
+            <w:pPr>
+              <w:pStyle w:val="15"/>
+              <w:spacing w:before="0" w:after="0" w:line="240" w:lineRule="auto"/>
+            </w:pPr>
+            <w:r>
+              <w:rPr>
+                <w:sz w:val="20"/>
+                <w:szCs w:val="20"/>
+              </w:rPr>
+              <w:t>38.32</w:t>
             </w:r>
           </w:p>
         </w:tc>
@@ -2268,64 +2010,64 @@
                 <w:sz w:val="20"/>
                 <w:szCs w:val="20"/>
               </w:rPr>
-              <w:t>12</w:t>
-            </w:r>
-          </w:p>
-        </w:tc>
-        <w:tc>
-          <w:tcPr>
-            <w:tcW w:w="2340" w:type="dxa"/>
-            <w:vAlign w:val="center"/>
-          </w:tcPr>
-          <w:p>
-            <w:pPr>
-              <w:pStyle w:val="15"/>
-              <w:spacing w:before="0" w:after="0" w:line="240" w:lineRule="auto"/>
-            </w:pPr>
-            <w:r>
-              <w:rPr>
-                <w:sz w:val="20"/>
-                <w:szCs w:val="20"/>
-              </w:rPr>
-              <w:t>TTCA</w:t>
-            </w:r>
-          </w:p>
-        </w:tc>
-        <w:tc>
-          <w:tcPr>
-            <w:tcW w:w="2340" w:type="dxa"/>
-            <w:vAlign w:val="center"/>
-          </w:tcPr>
-          <w:p>
-            <w:pPr>
-              <w:pStyle w:val="15"/>
-              <w:spacing w:before="0" w:after="0" w:line="240" w:lineRule="auto"/>
-            </w:pPr>
-            <w:r>
-              <w:rPr>
-                <w:sz w:val="20"/>
-                <w:szCs w:val="20"/>
-              </w:rPr>
-              <w:t>2,666,759</w:t>
-            </w:r>
-          </w:p>
-        </w:tc>
-        <w:tc>
-          <w:tcPr>
-            <w:tcW w:w="2340" w:type="dxa"/>
-            <w:vAlign w:val="center"/>
-          </w:tcPr>
-          <w:p>
-            <w:pPr>
-              <w:pStyle w:val="15"/>
-              <w:spacing w:before="0" w:after="0" w:line="240" w:lineRule="auto"/>
-            </w:pPr>
-            <w:r>
-              <w:rPr>
-                <w:sz w:val="20"/>
-                <w:szCs w:val="20"/>
-              </w:rPr>
-              <w:t>22.75</w:t>
+              <w:t>9</w:t>
+            </w:r>
+          </w:p>
+        </w:tc>
+        <w:tc>
+          <w:tcPr>
+            <w:tcW w:w="2340" w:type="dxa"/>
+            <w:vAlign w:val="center"/>
+          </w:tcPr>
+          <w:p>
+            <w:pPr>
+              <w:pStyle w:val="15"/>
+              <w:spacing w:before="0" w:after="0" w:line="240" w:lineRule="auto"/>
+            </w:pPr>
+            <w:r>
+              <w:rPr>
+                <w:sz w:val="20"/>
+                <w:szCs w:val="20"/>
+              </w:rPr>
+              <w:t>Anticancer (main)</w:t>
+            </w:r>
+          </w:p>
+        </w:tc>
+        <w:tc>
+          <w:tcPr>
+            <w:tcW w:w="2340" w:type="dxa"/>
+            <w:vAlign w:val="center"/>
+          </w:tcPr>
+          <w:p>
+            <w:pPr>
+              <w:pStyle w:val="15"/>
+              <w:spacing w:before="0" w:after="0" w:line="240" w:lineRule="auto"/>
+            </w:pPr>
+            <w:r>
+              <w:rPr>
+                <w:sz w:val="20"/>
+                <w:szCs w:val="20"/>
+              </w:rPr>
+              <w:t>2,357,718</w:t>
+            </w:r>
+          </w:p>
+        </w:tc>
+        <w:tc>
+          <w:tcPr>
+            <w:tcW w:w="2340" w:type="dxa"/>
+            <w:vAlign w:val="center"/>
+          </w:tcPr>
+          <w:p>
+            <w:pPr>
+              <w:pStyle w:val="15"/>
+              <w:spacing w:before="0" w:after="0" w:line="240" w:lineRule="auto"/>
+            </w:pPr>
+            <w:r>
+              <w:rPr>
+                <w:sz w:val="20"/>
+                <w:szCs w:val="20"/>
+              </w:rPr>
+              <w:t>20.11</w:t>
             </w:r>
           </w:p>
         </w:tc>
@@ -2362,64 +2104,64 @@
                 <w:sz w:val="20"/>
                 <w:szCs w:val="20"/>
               </w:rPr>
-              <w:t>13</w:t>
-            </w:r>
-          </w:p>
-        </w:tc>
-        <w:tc>
-          <w:tcPr>
-            <w:tcW w:w="2340" w:type="dxa"/>
-            <w:vAlign w:val="center"/>
-          </w:tcPr>
-          <w:p>
-            <w:pPr>
-              <w:pStyle w:val="15"/>
-              <w:spacing w:before="0" w:after="0" w:line="240" w:lineRule="auto"/>
-            </w:pPr>
-            <w:r>
-              <w:rPr>
-                <w:sz w:val="20"/>
-                <w:szCs w:val="20"/>
-              </w:rPr>
-              <w:t>BBB (BBP)</w:t>
-            </w:r>
-          </w:p>
-        </w:tc>
-        <w:tc>
-          <w:tcPr>
-            <w:tcW w:w="2340" w:type="dxa"/>
-            <w:vAlign w:val="center"/>
-          </w:tcPr>
-          <w:p>
-            <w:pPr>
-              <w:pStyle w:val="15"/>
-              <w:spacing w:before="0" w:after="0" w:line="240" w:lineRule="auto"/>
-            </w:pPr>
-            <w:r>
-              <w:rPr>
-                <w:sz w:val="20"/>
-                <w:szCs w:val="20"/>
-              </w:rPr>
-              <w:t>1,125,832</w:t>
-            </w:r>
-          </w:p>
-        </w:tc>
-        <w:tc>
-          <w:tcPr>
-            <w:tcW w:w="2340" w:type="dxa"/>
-            <w:vAlign w:val="center"/>
-          </w:tcPr>
-          <w:p>
-            <w:pPr>
-              <w:pStyle w:val="15"/>
-              <w:spacing w:before="0" w:after="0" w:line="240" w:lineRule="auto"/>
-            </w:pPr>
-            <w:r>
-              <w:rPr>
-                <w:sz w:val="20"/>
-                <w:szCs w:val="20"/>
-              </w:rPr>
-              <w:t>9.60</w:t>
+              <w:t>10</w:t>
+            </w:r>
+          </w:p>
+        </w:tc>
+        <w:tc>
+          <w:tcPr>
+            <w:tcW w:w="2340" w:type="dxa"/>
+            <w:vAlign w:val="center"/>
+          </w:tcPr>
+          <w:p>
+            <w:pPr>
+              <w:pStyle w:val="15"/>
+              <w:spacing w:before="0" w:after="0" w:line="240" w:lineRule="auto"/>
+            </w:pPr>
+            <w:r>
+              <w:rPr>
+                <w:sz w:val="20"/>
+                <w:szCs w:val="20"/>
+              </w:rPr>
+              <w:t>Anticancer (alternative)</w:t>
+            </w:r>
+          </w:p>
+        </w:tc>
+        <w:tc>
+          <w:tcPr>
+            <w:tcW w:w="2340" w:type="dxa"/>
+            <w:vAlign w:val="center"/>
+          </w:tcPr>
+          <w:p>
+            <w:pPr>
+              <w:pStyle w:val="15"/>
+              <w:spacing w:before="0" w:after="0" w:line="240" w:lineRule="auto"/>
+            </w:pPr>
+            <w:r>
+              <w:rPr>
+                <w:sz w:val="20"/>
+                <w:szCs w:val="20"/>
+              </w:rPr>
+              <w:t>2,015,652</w:t>
+            </w:r>
+          </w:p>
+        </w:tc>
+        <w:tc>
+          <w:tcPr>
+            <w:tcW w:w="2340" w:type="dxa"/>
+            <w:vAlign w:val="center"/>
+          </w:tcPr>
+          <w:p>
+            <w:pPr>
+              <w:pStyle w:val="15"/>
+              <w:spacing w:before="0" w:after="0" w:line="240" w:lineRule="auto"/>
+            </w:pPr>
+            <w:r>
+              <w:rPr>
+                <w:sz w:val="20"/>
+                <w:szCs w:val="20"/>
+              </w:rPr>
+              <w:t>17.20</w:t>
             </w:r>
           </w:p>
         </w:tc>
@@ -2456,64 +2198,64 @@
                 <w:sz w:val="20"/>
                 <w:szCs w:val="20"/>
               </w:rPr>
-              <w:t>14</w:t>
-            </w:r>
-          </w:p>
-        </w:tc>
-        <w:tc>
-          <w:tcPr>
-            <w:tcW w:w="2340" w:type="dxa"/>
-            <w:vAlign w:val="center"/>
-          </w:tcPr>
-          <w:p>
-            <w:pPr>
-              <w:pStyle w:val="15"/>
-              <w:spacing w:before="0" w:after="0" w:line="240" w:lineRule="auto"/>
-            </w:pPr>
-            <w:r>
-              <w:rPr>
-                <w:sz w:val="20"/>
-                <w:szCs w:val="20"/>
-              </w:rPr>
-              <w:t>Anti-parasitic (APP)</w:t>
-            </w:r>
-          </w:p>
-        </w:tc>
-        <w:tc>
-          <w:tcPr>
-            <w:tcW w:w="2340" w:type="dxa"/>
-            <w:vAlign w:val="center"/>
-          </w:tcPr>
-          <w:p>
-            <w:pPr>
-              <w:pStyle w:val="15"/>
-              <w:spacing w:before="0" w:after="0" w:line="240" w:lineRule="auto"/>
-            </w:pPr>
-            <w:r>
-              <w:rPr>
-                <w:sz w:val="20"/>
-                <w:szCs w:val="20"/>
-              </w:rPr>
-              <w:t>5,462,493</w:t>
-            </w:r>
-          </w:p>
-        </w:tc>
-        <w:tc>
-          <w:tcPr>
-            <w:tcW w:w="2340" w:type="dxa"/>
-            <w:vAlign w:val="center"/>
-          </w:tcPr>
-          <w:p>
-            <w:pPr>
-              <w:pStyle w:val="15"/>
-              <w:spacing w:before="0" w:after="0" w:line="240" w:lineRule="auto"/>
-            </w:pPr>
-            <w:r>
-              <w:rPr>
-                <w:sz w:val="20"/>
-                <w:szCs w:val="20"/>
-              </w:rPr>
-              <w:t>46.60</w:t>
+              <w:t>11</w:t>
+            </w:r>
+          </w:p>
+        </w:tc>
+        <w:tc>
+          <w:tcPr>
+            <w:tcW w:w="2340" w:type="dxa"/>
+            <w:vAlign w:val="center"/>
+          </w:tcPr>
+          <w:p>
+            <w:pPr>
+              <w:pStyle w:val="15"/>
+              <w:spacing w:before="0" w:after="0" w:line="240" w:lineRule="auto"/>
+            </w:pPr>
+            <w:r>
+              <w:rPr>
+                <w:sz w:val="20"/>
+                <w:szCs w:val="20"/>
+              </w:rPr>
+              <w:t>Anti-MRSA</w:t>
+            </w:r>
+          </w:p>
+        </w:tc>
+        <w:tc>
+          <w:tcPr>
+            <w:tcW w:w="2340" w:type="dxa"/>
+            <w:vAlign w:val="center"/>
+          </w:tcPr>
+          <w:p>
+            <w:pPr>
+              <w:pStyle w:val="15"/>
+              <w:spacing w:before="0" w:after="0" w:line="240" w:lineRule="auto"/>
+            </w:pPr>
+            <w:r>
+              <w:rPr>
+                <w:sz w:val="20"/>
+                <w:szCs w:val="20"/>
+              </w:rPr>
+              <w:t>843,977</w:t>
+            </w:r>
+          </w:p>
+        </w:tc>
+        <w:tc>
+          <w:tcPr>
+            <w:tcW w:w="2340" w:type="dxa"/>
+            <w:vAlign w:val="center"/>
+          </w:tcPr>
+          <w:p>
+            <w:pPr>
+              <w:pStyle w:val="15"/>
+              <w:spacing w:before="0" w:after="0" w:line="240" w:lineRule="auto"/>
+            </w:pPr>
+            <w:r>
+              <w:rPr>
+                <w:sz w:val="20"/>
+                <w:szCs w:val="20"/>
+              </w:rPr>
+              <w:t>7.20</w:t>
             </w:r>
           </w:p>
         </w:tc>
@@ -2550,64 +2292,64 @@
                 <w:sz w:val="20"/>
                 <w:szCs w:val="20"/>
               </w:rPr>
-              <w:t>15</w:t>
-            </w:r>
-          </w:p>
-        </w:tc>
-        <w:tc>
-          <w:tcPr>
-            <w:tcW w:w="2340" w:type="dxa"/>
-            <w:vAlign w:val="center"/>
-          </w:tcPr>
-          <w:p>
-            <w:pPr>
-              <w:pStyle w:val="15"/>
-              <w:spacing w:before="0" w:after="0" w:line="240" w:lineRule="auto"/>
-            </w:pPr>
-            <w:r>
-              <w:rPr>
-                <w:sz w:val="20"/>
-                <w:szCs w:val="20"/>
-              </w:rPr>
-              <w:t>NeuroPred</w:t>
-            </w:r>
-          </w:p>
-        </w:tc>
-        <w:tc>
-          <w:tcPr>
-            <w:tcW w:w="2340" w:type="dxa"/>
-            <w:vAlign w:val="center"/>
-          </w:tcPr>
-          <w:p>
-            <w:pPr>
-              <w:pStyle w:val="15"/>
-              <w:spacing w:before="0" w:after="0" w:line="240" w:lineRule="auto"/>
-            </w:pPr>
-            <w:r>
-              <w:rPr>
-                <w:sz w:val="20"/>
-                <w:szCs w:val="20"/>
-              </w:rPr>
-              <w:t>1,714,373</w:t>
-            </w:r>
-          </w:p>
-        </w:tc>
-        <w:tc>
-          <w:tcPr>
-            <w:tcW w:w="2340" w:type="dxa"/>
-            <w:vAlign w:val="center"/>
-          </w:tcPr>
-          <w:p>
-            <w:pPr>
-              <w:pStyle w:val="15"/>
-              <w:spacing w:before="0" w:after="0" w:line="240" w:lineRule="auto"/>
-            </w:pPr>
-            <w:r>
-              <w:rPr>
-                <w:sz w:val="20"/>
-                <w:szCs w:val="20"/>
-              </w:rPr>
-              <w:t>14.63</w:t>
+              <w:t>12</w:t>
+            </w:r>
+          </w:p>
+        </w:tc>
+        <w:tc>
+          <w:tcPr>
+            <w:tcW w:w="2340" w:type="dxa"/>
+            <w:vAlign w:val="center"/>
+          </w:tcPr>
+          <w:p>
+            <w:pPr>
+              <w:pStyle w:val="15"/>
+              <w:spacing w:before="0" w:after="0" w:line="240" w:lineRule="auto"/>
+            </w:pPr>
+            <w:r>
+              <w:rPr>
+                <w:sz w:val="20"/>
+                <w:szCs w:val="20"/>
+              </w:rPr>
+              <w:t>TTCA</w:t>
+            </w:r>
+          </w:p>
+        </w:tc>
+        <w:tc>
+          <w:tcPr>
+            <w:tcW w:w="2340" w:type="dxa"/>
+            <w:vAlign w:val="center"/>
+          </w:tcPr>
+          <w:p>
+            <w:pPr>
+              <w:pStyle w:val="15"/>
+              <w:spacing w:before="0" w:after="0" w:line="240" w:lineRule="auto"/>
+            </w:pPr>
+            <w:r>
+              <w:rPr>
+                <w:sz w:val="20"/>
+                <w:szCs w:val="20"/>
+              </w:rPr>
+              <w:t>2,666,759</w:t>
+            </w:r>
+          </w:p>
+        </w:tc>
+        <w:tc>
+          <w:tcPr>
+            <w:tcW w:w="2340" w:type="dxa"/>
+            <w:vAlign w:val="center"/>
+          </w:tcPr>
+          <w:p>
+            <w:pPr>
+              <w:pStyle w:val="15"/>
+              <w:spacing w:before="0" w:after="0" w:line="240" w:lineRule="auto"/>
+            </w:pPr>
+            <w:r>
+              <w:rPr>
+                <w:sz w:val="20"/>
+                <w:szCs w:val="20"/>
+              </w:rPr>
+              <w:t>22.75</w:t>
             </w:r>
           </w:p>
         </w:tc>
@@ -2644,64 +2386,64 @@
                 <w:sz w:val="20"/>
                 <w:szCs w:val="20"/>
               </w:rPr>
-              <w:t>16</w:t>
-            </w:r>
-          </w:p>
-        </w:tc>
-        <w:tc>
-          <w:tcPr>
-            <w:tcW w:w="2340" w:type="dxa"/>
-            <w:vAlign w:val="center"/>
-          </w:tcPr>
-          <w:p>
-            <w:pPr>
-              <w:pStyle w:val="15"/>
-              <w:spacing w:before="0" w:after="0" w:line="240" w:lineRule="auto"/>
-            </w:pPr>
-            <w:r>
-              <w:rPr>
-                <w:sz w:val="20"/>
-                <w:szCs w:val="20"/>
-              </w:rPr>
-              <w:t>Antibacterial</w:t>
-            </w:r>
-          </w:p>
-        </w:tc>
-        <w:tc>
-          <w:tcPr>
-            <w:tcW w:w="2340" w:type="dxa"/>
-            <w:vAlign w:val="center"/>
-          </w:tcPr>
-          <w:p>
-            <w:pPr>
-              <w:pStyle w:val="15"/>
-              <w:spacing w:before="0" w:after="0" w:line="240" w:lineRule="auto"/>
-            </w:pPr>
-            <w:r>
-              <w:rPr>
-                <w:sz w:val="20"/>
-                <w:szCs w:val="20"/>
-              </w:rPr>
-              <w:t>2,597,877</w:t>
-            </w:r>
-          </w:p>
-        </w:tc>
-        <w:tc>
-          <w:tcPr>
-            <w:tcW w:w="2340" w:type="dxa"/>
-            <w:vAlign w:val="center"/>
-          </w:tcPr>
-          <w:p>
-            <w:pPr>
-              <w:pStyle w:val="15"/>
-              <w:spacing w:before="0" w:after="0" w:line="240" w:lineRule="auto"/>
-            </w:pPr>
-            <w:r>
-              <w:rPr>
-                <w:sz w:val="20"/>
-                <w:szCs w:val="20"/>
-              </w:rPr>
-              <w:t>22.16</w:t>
+              <w:t>13</w:t>
+            </w:r>
+          </w:p>
+        </w:tc>
+        <w:tc>
+          <w:tcPr>
+            <w:tcW w:w="2340" w:type="dxa"/>
+            <w:vAlign w:val="center"/>
+          </w:tcPr>
+          <w:p>
+            <w:pPr>
+              <w:pStyle w:val="15"/>
+              <w:spacing w:before="0" w:after="0" w:line="240" w:lineRule="auto"/>
+            </w:pPr>
+            <w:r>
+              <w:rPr>
+                <w:sz w:val="20"/>
+                <w:szCs w:val="20"/>
+              </w:rPr>
+              <w:t>BBB (BBP)</w:t>
+            </w:r>
+          </w:p>
+        </w:tc>
+        <w:tc>
+          <w:tcPr>
+            <w:tcW w:w="2340" w:type="dxa"/>
+            <w:vAlign w:val="center"/>
+          </w:tcPr>
+          <w:p>
+            <w:pPr>
+              <w:pStyle w:val="15"/>
+              <w:spacing w:before="0" w:after="0" w:line="240" w:lineRule="auto"/>
+            </w:pPr>
+            <w:r>
+              <w:rPr>
+                <w:sz w:val="20"/>
+                <w:szCs w:val="20"/>
+              </w:rPr>
+              <w:t>1,125,832</w:t>
+            </w:r>
+          </w:p>
+        </w:tc>
+        <w:tc>
+          <w:tcPr>
+            <w:tcW w:w="2340" w:type="dxa"/>
+            <w:vAlign w:val="center"/>
+          </w:tcPr>
+          <w:p>
+            <w:pPr>
+              <w:pStyle w:val="15"/>
+              <w:spacing w:before="0" w:after="0" w:line="240" w:lineRule="auto"/>
+            </w:pPr>
+            <w:r>
+              <w:rPr>
+                <w:sz w:val="20"/>
+                <w:szCs w:val="20"/>
+              </w:rPr>
+              <w:t>9.60</w:t>
             </w:r>
           </w:p>
         </w:tc>
@@ -2722,6 +2464,276 @@
             <w:bottom w:w="70" w:type="dxa"/>
             <w:right w:w="80" w:type="dxa"/>
           </w:tblCellMar>
+        </w:tblPrEx>
+        <w:tc>
+          <w:tcPr>
+            <w:tcW w:w="2340" w:type="dxa"/>
+            <w:vAlign w:val="center"/>
+          </w:tcPr>
+          <w:p>
+            <w:pPr>
+              <w:pStyle w:val="15"/>
+              <w:spacing w:before="0" w:after="0" w:line="240" w:lineRule="auto"/>
+            </w:pPr>
+            <w:r>
+              <w:rPr>
+                <w:sz w:val="20"/>
+                <w:szCs w:val="20"/>
+              </w:rPr>
+              <w:t>14</w:t>
+            </w:r>
+          </w:p>
+        </w:tc>
+        <w:tc>
+          <w:tcPr>
+            <w:tcW w:w="2340" w:type="dxa"/>
+            <w:vAlign w:val="center"/>
+          </w:tcPr>
+          <w:p>
+            <w:pPr>
+              <w:pStyle w:val="15"/>
+              <w:spacing w:before="0" w:after="0" w:line="240" w:lineRule="auto"/>
+            </w:pPr>
+            <w:r>
+              <w:rPr>
+                <w:sz w:val="20"/>
+                <w:szCs w:val="20"/>
+              </w:rPr>
+              <w:t>Anti-parasitic (APP)</w:t>
+            </w:r>
+          </w:p>
+        </w:tc>
+        <w:tc>
+          <w:tcPr>
+            <w:tcW w:w="2340" w:type="dxa"/>
+            <w:vAlign w:val="center"/>
+          </w:tcPr>
+          <w:p>
+            <w:pPr>
+              <w:pStyle w:val="15"/>
+              <w:spacing w:before="0" w:after="0" w:line="240" w:lineRule="auto"/>
+            </w:pPr>
+            <w:r>
+              <w:rPr>
+                <w:sz w:val="20"/>
+                <w:szCs w:val="20"/>
+              </w:rPr>
+              <w:t>5,462,493</w:t>
+            </w:r>
+          </w:p>
+        </w:tc>
+        <w:tc>
+          <w:tcPr>
+            <w:tcW w:w="2340" w:type="dxa"/>
+            <w:vAlign w:val="center"/>
+          </w:tcPr>
+          <w:p>
+            <w:pPr>
+              <w:pStyle w:val="15"/>
+              <w:spacing w:before="0" w:after="0" w:line="240" w:lineRule="auto"/>
+            </w:pPr>
+            <w:r>
+              <w:rPr>
+                <w:sz w:val="20"/>
+                <w:szCs w:val="20"/>
+              </w:rPr>
+              <w:t>46.60</w:t>
+            </w:r>
+          </w:p>
+        </w:tc>
+      </w:tr>
+      <w:tr>
+        <w:tblPrEx>
+          <w:tblBorders>
+            <w:top w:val="single" w:color="000000" w:sz="12" w:space="0"/>
+            <w:left w:val="none" w:color="auto" w:sz="0" w:space="0"/>
+            <w:bottom w:val="single" w:color="000000" w:sz="12" w:space="0"/>
+            <w:right w:val="none" w:color="auto" w:sz="0" w:space="0"/>
+            <w:insideH w:val="none" w:color="auto" w:sz="0" w:space="0"/>
+            <w:insideV w:val="none" w:color="auto" w:sz="0" w:space="0"/>
+          </w:tblBorders>
+        </w:tblPrEx>
+        <w:tc>
+          <w:tcPr>
+            <w:tcW w:w="2340" w:type="dxa"/>
+            <w:vAlign w:val="center"/>
+          </w:tcPr>
+          <w:p>
+            <w:pPr>
+              <w:pStyle w:val="15"/>
+              <w:spacing w:before="0" w:after="0" w:line="240" w:lineRule="auto"/>
+            </w:pPr>
+            <w:r>
+              <w:rPr>
+                <w:sz w:val="20"/>
+                <w:szCs w:val="20"/>
+              </w:rPr>
+              <w:t>15</w:t>
+            </w:r>
+          </w:p>
+        </w:tc>
+        <w:tc>
+          <w:tcPr>
+            <w:tcW w:w="2340" w:type="dxa"/>
+            <w:vAlign w:val="center"/>
+          </w:tcPr>
+          <w:p>
+            <w:pPr>
+              <w:pStyle w:val="15"/>
+              <w:spacing w:before="0" w:after="0" w:line="240" w:lineRule="auto"/>
+            </w:pPr>
+            <w:r>
+              <w:rPr>
+                <w:sz w:val="20"/>
+                <w:szCs w:val="20"/>
+              </w:rPr>
+              <w:t>NeuroPred</w:t>
+            </w:r>
+          </w:p>
+        </w:tc>
+        <w:tc>
+          <w:tcPr>
+            <w:tcW w:w="2340" w:type="dxa"/>
+            <w:vAlign w:val="center"/>
+          </w:tcPr>
+          <w:p>
+            <w:pPr>
+              <w:pStyle w:val="15"/>
+              <w:spacing w:before="0" w:after="0" w:line="240" w:lineRule="auto"/>
+            </w:pPr>
+            <w:r>
+              <w:rPr>
+                <w:sz w:val="20"/>
+                <w:szCs w:val="20"/>
+              </w:rPr>
+              <w:t>1,714,373</w:t>
+            </w:r>
+          </w:p>
+        </w:tc>
+        <w:tc>
+          <w:tcPr>
+            <w:tcW w:w="2340" w:type="dxa"/>
+            <w:vAlign w:val="center"/>
+          </w:tcPr>
+          <w:p>
+            <w:pPr>
+              <w:pStyle w:val="15"/>
+              <w:spacing w:before="0" w:after="0" w:line="240" w:lineRule="auto"/>
+            </w:pPr>
+            <w:r>
+              <w:rPr>
+                <w:sz w:val="20"/>
+                <w:szCs w:val="20"/>
+              </w:rPr>
+              <w:t>14.63</w:t>
+            </w:r>
+          </w:p>
+        </w:tc>
+      </w:tr>
+      <w:tr>
+        <w:tblPrEx>
+          <w:tblBorders>
+            <w:top w:val="single" w:color="000000" w:sz="12" w:space="0"/>
+            <w:left w:val="none" w:color="auto" w:sz="0" w:space="0"/>
+            <w:bottom w:val="single" w:color="000000" w:sz="12" w:space="0"/>
+            <w:right w:val="none" w:color="auto" w:sz="0" w:space="0"/>
+            <w:insideH w:val="none" w:color="auto" w:sz="0" w:space="0"/>
+            <w:insideV w:val="none" w:color="auto" w:sz="0" w:space="0"/>
+          </w:tblBorders>
+          <w:tblCellMar>
+            <w:top w:w="70" w:type="dxa"/>
+            <w:left w:w="80" w:type="dxa"/>
+            <w:bottom w:w="70" w:type="dxa"/>
+            <w:right w:w="80" w:type="dxa"/>
+          </w:tblCellMar>
+        </w:tblPrEx>
+        <w:tc>
+          <w:tcPr>
+            <w:tcW w:w="2340" w:type="dxa"/>
+            <w:vAlign w:val="center"/>
+          </w:tcPr>
+          <w:p>
+            <w:pPr>
+              <w:pStyle w:val="15"/>
+              <w:spacing w:before="0" w:after="0" w:line="240" w:lineRule="auto"/>
+            </w:pPr>
+            <w:r>
+              <w:rPr>
+                <w:sz w:val="20"/>
+                <w:szCs w:val="20"/>
+              </w:rPr>
+              <w:t>16</w:t>
+            </w:r>
+          </w:p>
+        </w:tc>
+        <w:tc>
+          <w:tcPr>
+            <w:tcW w:w="2340" w:type="dxa"/>
+            <w:vAlign w:val="center"/>
+          </w:tcPr>
+          <w:p>
+            <w:pPr>
+              <w:pStyle w:val="15"/>
+              <w:spacing w:before="0" w:after="0" w:line="240" w:lineRule="auto"/>
+            </w:pPr>
+            <w:r>
+              <w:rPr>
+                <w:sz w:val="20"/>
+                <w:szCs w:val="20"/>
+              </w:rPr>
+              <w:t>Antibacterial</w:t>
+            </w:r>
+          </w:p>
+        </w:tc>
+        <w:tc>
+          <w:tcPr>
+            <w:tcW w:w="2340" w:type="dxa"/>
+            <w:vAlign w:val="center"/>
+          </w:tcPr>
+          <w:p>
+            <w:pPr>
+              <w:pStyle w:val="15"/>
+              <w:spacing w:before="0" w:after="0" w:line="240" w:lineRule="auto"/>
+            </w:pPr>
+            <w:r>
+              <w:rPr>
+                <w:sz w:val="20"/>
+                <w:szCs w:val="20"/>
+              </w:rPr>
+              <w:t>2,597,877</w:t>
+            </w:r>
+          </w:p>
+        </w:tc>
+        <w:tc>
+          <w:tcPr>
+            <w:tcW w:w="2340" w:type="dxa"/>
+            <w:vAlign w:val="center"/>
+          </w:tcPr>
+          <w:p>
+            <w:pPr>
+              <w:pStyle w:val="15"/>
+              <w:spacing w:before="0" w:after="0" w:line="240" w:lineRule="auto"/>
+            </w:pPr>
+            <w:r>
+              <w:rPr>
+                <w:sz w:val="20"/>
+                <w:szCs w:val="20"/>
+              </w:rPr>
+              <w:t>22.16</w:t>
+            </w:r>
+          </w:p>
+        </w:tc>
+      </w:tr>
+      <w:tr>
+        <w:tblPrEx>
+          <w:tblBorders>
+            <w:top w:val="single" w:color="000000" w:sz="12" w:space="0"/>
+            <w:left w:val="none" w:color="auto" w:sz="0" w:space="0"/>
+            <w:bottom w:val="single" w:color="000000" w:sz="12" w:space="0"/>
+            <w:right w:val="none" w:color="auto" w:sz="0" w:space="0"/>
+            <w:insideH w:val="none" w:color="auto" w:sz="0" w:space="0"/>
+            <w:insideV w:val="none" w:color="auto" w:sz="0" w:space="0"/>
+          </w:tblBorders>
         </w:tblPrEx>
         <w:tc>
           <w:tcPr>
@@ -3621,6 +3633,12 @@
             <w:insideH w:val="none" w:color="auto" w:sz="0" w:space="0"/>
             <w:insideV w:val="none" w:color="auto" w:sz="0" w:space="0"/>
           </w:tblBorders>
+          <w:tblCellMar>
+            <w:top w:w="70" w:type="dxa"/>
+            <w:left w:w="80" w:type="dxa"/>
+            <w:bottom w:w="70" w:type="dxa"/>
+            <w:right w:w="80" w:type="dxa"/>
+          </w:tblCellMar>
         </w:tblPrEx>
         <w:tc>
           <w:tcPr>
@@ -3803,6 +3821,12 @@
             <w:insideH w:val="none" w:color="auto" w:sz="0" w:space="0"/>
             <w:insideV w:val="none" w:color="auto" w:sz="0" w:space="0"/>
           </w:tblBorders>
+          <w:tblCellMar>
+            <w:top w:w="70" w:type="dxa"/>
+            <w:left w:w="80" w:type="dxa"/>
+            <w:bottom w:w="70" w:type="dxa"/>
+            <w:right w:w="80" w:type="dxa"/>
+          </w:tblCellMar>
         </w:tblPrEx>
         <w:tc>
           <w:tcPr>
@@ -3877,182 +3901,6 @@
                 <w:szCs w:val="20"/>
               </w:rPr>
               <w:t>87.69</w:t>
-            </w:r>
-          </w:p>
-        </w:tc>
-      </w:tr>
-      <w:tr>
-        <w:tblPrEx>
-          <w:tblBorders>
-            <w:top w:val="single" w:color="000000" w:sz="12" w:space="0"/>
-            <w:left w:val="none" w:color="auto" w:sz="0" w:space="0"/>
-            <w:bottom w:val="single" w:color="000000" w:sz="12" w:space="0"/>
-            <w:right w:val="none" w:color="auto" w:sz="0" w:space="0"/>
-            <w:insideH w:val="none" w:color="auto" w:sz="0" w:space="0"/>
-            <w:insideV w:val="none" w:color="auto" w:sz="0" w:space="0"/>
-          </w:tblBorders>
-        </w:tblPrEx>
-        <w:tc>
-          <w:tcPr>
-            <w:tcW w:w="2340" w:type="dxa"/>
-            <w:vAlign w:val="center"/>
-          </w:tcPr>
-          <w:p>
-            <w:pPr>
-              <w:pStyle w:val="15"/>
-              <w:spacing w:before="0" w:after="0" w:line="240" w:lineRule="auto"/>
-            </w:pPr>
-            <w:r>
-              <w:rPr>
-                <w:sz w:val="20"/>
-                <w:szCs w:val="20"/>
-              </w:rPr>
-              <w:t>6</w:t>
-            </w:r>
-          </w:p>
-        </w:tc>
-        <w:tc>
-          <w:tcPr>
-            <w:tcW w:w="2340" w:type="dxa"/>
-            <w:vAlign w:val="center"/>
-          </w:tcPr>
-          <w:p>
-            <w:pPr>
-              <w:pStyle w:val="15"/>
-              <w:spacing w:before="0" w:after="0" w:line="240" w:lineRule="auto"/>
-            </w:pPr>
-            <w:r>
-              <w:rPr>
-                <w:sz w:val="20"/>
-                <w:szCs w:val="20"/>
-              </w:rPr>
-              <w:t>Antimalarial (alternative)</w:t>
-            </w:r>
-          </w:p>
-        </w:tc>
-        <w:tc>
-          <w:tcPr>
-            <w:tcW w:w="2340" w:type="dxa"/>
-            <w:vAlign w:val="center"/>
-          </w:tcPr>
-          <w:p>
-            <w:pPr>
-              <w:pStyle w:val="15"/>
-              <w:spacing w:before="0" w:after="0" w:line="240" w:lineRule="auto"/>
-            </w:pPr>
-            <w:r>
-              <w:rPr>
-                <w:sz w:val="20"/>
-                <w:szCs w:val="20"/>
-              </w:rPr>
-              <w:t>703,632</w:t>
-            </w:r>
-          </w:p>
-        </w:tc>
-        <w:tc>
-          <w:tcPr>
-            <w:tcW w:w="2340" w:type="dxa"/>
-            <w:vAlign w:val="center"/>
-          </w:tcPr>
-          <w:p>
-            <w:pPr>
-              <w:pStyle w:val="15"/>
-              <w:spacing w:before="0" w:after="0" w:line="240" w:lineRule="auto"/>
-            </w:pPr>
-            <w:r>
-              <w:rPr>
-                <w:sz w:val="20"/>
-                <w:szCs w:val="20"/>
-              </w:rPr>
-              <w:t>6.24</w:t>
-            </w:r>
-          </w:p>
-        </w:tc>
-      </w:tr>
-      <w:tr>
-        <w:tblPrEx>
-          <w:tblBorders>
-            <w:top w:val="single" w:color="000000" w:sz="12" w:space="0"/>
-            <w:left w:val="none" w:color="auto" w:sz="0" w:space="0"/>
-            <w:bottom w:val="single" w:color="000000" w:sz="12" w:space="0"/>
-            <w:right w:val="none" w:color="auto" w:sz="0" w:space="0"/>
-            <w:insideH w:val="none" w:color="auto" w:sz="0" w:space="0"/>
-            <w:insideV w:val="none" w:color="auto" w:sz="0" w:space="0"/>
-          </w:tblBorders>
-        </w:tblPrEx>
-        <w:tc>
-          <w:tcPr>
-            <w:tcW w:w="2340" w:type="dxa"/>
-            <w:vAlign w:val="center"/>
-          </w:tcPr>
-          <w:p>
-            <w:pPr>
-              <w:pStyle w:val="15"/>
-              <w:spacing w:before="0" w:after="0" w:line="240" w:lineRule="auto"/>
-            </w:pPr>
-            <w:r>
-              <w:rPr>
-                <w:sz w:val="20"/>
-                <w:szCs w:val="20"/>
-              </w:rPr>
-              <w:t>7</w:t>
-            </w:r>
-          </w:p>
-        </w:tc>
-        <w:tc>
-          <w:tcPr>
-            <w:tcW w:w="2340" w:type="dxa"/>
-            <w:vAlign w:val="center"/>
-          </w:tcPr>
-          <w:p>
-            <w:pPr>
-              <w:pStyle w:val="15"/>
-              <w:spacing w:before="0" w:after="0" w:line="240" w:lineRule="auto"/>
-            </w:pPr>
-            <w:r>
-              <w:rPr>
-                <w:sz w:val="20"/>
-                <w:szCs w:val="20"/>
-              </w:rPr>
-              <w:t>Antimalarial (main)</w:t>
-            </w:r>
-          </w:p>
-        </w:tc>
-        <w:tc>
-          <w:tcPr>
-            <w:tcW w:w="2340" w:type="dxa"/>
-            <w:vAlign w:val="center"/>
-          </w:tcPr>
-          <w:p>
-            <w:pPr>
-              <w:pStyle w:val="15"/>
-              <w:spacing w:before="0" w:after="0" w:line="240" w:lineRule="auto"/>
-            </w:pPr>
-            <w:r>
-              <w:rPr>
-                <w:sz w:val="20"/>
-                <w:szCs w:val="20"/>
-              </w:rPr>
-              <w:t>1,954,667</w:t>
-            </w:r>
-          </w:p>
-        </w:tc>
-        <w:tc>
-          <w:tcPr>
-            <w:tcW w:w="2340" w:type="dxa"/>
-            <w:vAlign w:val="center"/>
-          </w:tcPr>
-          <w:p>
-            <w:pPr>
-              <w:pStyle w:val="15"/>
-              <w:spacing w:before="0" w:after="0" w:line="240" w:lineRule="auto"/>
-            </w:pPr>
-            <w:r>
-              <w:rPr>
-                <w:sz w:val="20"/>
-                <w:szCs w:val="20"/>
-              </w:rPr>
-              <w:t>17.34</w:t>
             </w:r>
           </w:p>
         </w:tc>
@@ -4089,152 +3937,64 @@
                 <w:sz w:val="20"/>
                 <w:szCs w:val="20"/>
               </w:rPr>
-              <w:t>8</w:t>
-            </w:r>
-          </w:p>
-        </w:tc>
-        <w:tc>
-          <w:tcPr>
-            <w:tcW w:w="2340" w:type="dxa"/>
-            <w:vAlign w:val="center"/>
-          </w:tcPr>
-          <w:p>
-            <w:pPr>
-              <w:pStyle w:val="15"/>
-              <w:spacing w:before="0" w:after="0" w:line="240" w:lineRule="auto"/>
-            </w:pPr>
-            <w:r>
-              <w:rPr>
-                <w:sz w:val="20"/>
-                <w:szCs w:val="20"/>
-              </w:rPr>
-              <w:t>Quorum sensing</w:t>
-            </w:r>
-          </w:p>
-        </w:tc>
-        <w:tc>
-          <w:tcPr>
-            <w:tcW w:w="2340" w:type="dxa"/>
-            <w:vAlign w:val="center"/>
-          </w:tcPr>
-          <w:p>
-            <w:pPr>
-              <w:pStyle w:val="15"/>
-              <w:spacing w:before="0" w:after="0" w:line="240" w:lineRule="auto"/>
-            </w:pPr>
-            <w:r>
-              <w:rPr>
-                <w:sz w:val="20"/>
-                <w:szCs w:val="20"/>
-              </w:rPr>
-              <w:t>4,161,825</w:t>
-            </w:r>
-          </w:p>
-        </w:tc>
-        <w:tc>
-          <w:tcPr>
-            <w:tcW w:w="2340" w:type="dxa"/>
-            <w:vAlign w:val="center"/>
-          </w:tcPr>
-          <w:p>
-            <w:pPr>
-              <w:pStyle w:val="15"/>
-              <w:spacing w:before="0" w:after="0" w:line="240" w:lineRule="auto"/>
-            </w:pPr>
-            <w:r>
-              <w:rPr>
-                <w:sz w:val="20"/>
-                <w:szCs w:val="20"/>
-              </w:rPr>
-              <w:t>36.93</w:t>
-            </w:r>
-          </w:p>
-        </w:tc>
-      </w:tr>
-      <w:tr>
-        <w:tblPrEx>
-          <w:tblBorders>
-            <w:top w:val="single" w:color="000000" w:sz="12" w:space="0"/>
-            <w:left w:val="none" w:color="auto" w:sz="0" w:space="0"/>
-            <w:bottom w:val="single" w:color="000000" w:sz="12" w:space="0"/>
-            <w:right w:val="none" w:color="auto" w:sz="0" w:space="0"/>
-            <w:insideH w:val="none" w:color="auto" w:sz="0" w:space="0"/>
-            <w:insideV w:val="none" w:color="auto" w:sz="0" w:space="0"/>
-          </w:tblBorders>
-        </w:tblPrEx>
-        <w:tc>
-          <w:tcPr>
-            <w:tcW w:w="2340" w:type="dxa"/>
-            <w:vAlign w:val="center"/>
-          </w:tcPr>
-          <w:p>
-            <w:pPr>
-              <w:pStyle w:val="15"/>
-              <w:spacing w:before="0" w:after="0" w:line="240" w:lineRule="auto"/>
-            </w:pPr>
-            <w:r>
-              <w:rPr>
-                <w:sz w:val="20"/>
-                <w:szCs w:val="20"/>
-              </w:rPr>
-              <w:t>9</w:t>
-            </w:r>
-          </w:p>
-        </w:tc>
-        <w:tc>
-          <w:tcPr>
-            <w:tcW w:w="2340" w:type="dxa"/>
-            <w:vAlign w:val="center"/>
-          </w:tcPr>
-          <w:p>
-            <w:pPr>
-              <w:pStyle w:val="15"/>
-              <w:spacing w:before="0" w:after="0" w:line="240" w:lineRule="auto"/>
-            </w:pPr>
-            <w:r>
-              <w:rPr>
-                <w:sz w:val="20"/>
-                <w:szCs w:val="20"/>
-              </w:rPr>
-              <w:t>Anticancer (main)</w:t>
-            </w:r>
-          </w:p>
-        </w:tc>
-        <w:tc>
-          <w:tcPr>
-            <w:tcW w:w="2340" w:type="dxa"/>
-            <w:vAlign w:val="center"/>
-          </w:tcPr>
-          <w:p>
-            <w:pPr>
-              <w:pStyle w:val="15"/>
-              <w:spacing w:before="0" w:after="0" w:line="240" w:lineRule="auto"/>
-            </w:pPr>
-            <w:r>
-              <w:rPr>
-                <w:sz w:val="20"/>
-                <w:szCs w:val="20"/>
-              </w:rPr>
-              <w:t>2,404,084</w:t>
-            </w:r>
-          </w:p>
-        </w:tc>
-        <w:tc>
-          <w:tcPr>
-            <w:tcW w:w="2340" w:type="dxa"/>
-            <w:vAlign w:val="center"/>
-          </w:tcPr>
-          <w:p>
-            <w:pPr>
-              <w:pStyle w:val="15"/>
-              <w:spacing w:before="0" w:after="0" w:line="240" w:lineRule="auto"/>
-            </w:pPr>
-            <w:r>
-              <w:rPr>
-                <w:sz w:val="20"/>
-                <w:szCs w:val="20"/>
-              </w:rPr>
-              <w:t>21.33</w:t>
+              <w:t>6</w:t>
+            </w:r>
+          </w:p>
+        </w:tc>
+        <w:tc>
+          <w:tcPr>
+            <w:tcW w:w="2340" w:type="dxa"/>
+            <w:vAlign w:val="center"/>
+          </w:tcPr>
+          <w:p>
+            <w:pPr>
+              <w:pStyle w:val="15"/>
+              <w:spacing w:before="0" w:after="0" w:line="240" w:lineRule="auto"/>
+            </w:pPr>
+            <w:r>
+              <w:rPr>
+                <w:sz w:val="20"/>
+                <w:szCs w:val="20"/>
+              </w:rPr>
+              <w:t>Antimalarial (alternative)</w:t>
+            </w:r>
+          </w:p>
+        </w:tc>
+        <w:tc>
+          <w:tcPr>
+            <w:tcW w:w="2340" w:type="dxa"/>
+            <w:vAlign w:val="center"/>
+          </w:tcPr>
+          <w:p>
+            <w:pPr>
+              <w:pStyle w:val="15"/>
+              <w:spacing w:before="0" w:after="0" w:line="240" w:lineRule="auto"/>
+            </w:pPr>
+            <w:r>
+              <w:rPr>
+                <w:sz w:val="20"/>
+                <w:szCs w:val="20"/>
+              </w:rPr>
+              <w:t>703,632</w:t>
+            </w:r>
+          </w:p>
+        </w:tc>
+        <w:tc>
+          <w:tcPr>
+            <w:tcW w:w="2340" w:type="dxa"/>
+            <w:vAlign w:val="center"/>
+          </w:tcPr>
+          <w:p>
+            <w:pPr>
+              <w:pStyle w:val="15"/>
+              <w:spacing w:before="0" w:after="0" w:line="240" w:lineRule="auto"/>
+            </w:pPr>
+            <w:r>
+              <w:rPr>
+                <w:sz w:val="20"/>
+                <w:szCs w:val="20"/>
+              </w:rPr>
+              <w:t>6.24</w:t>
             </w:r>
           </w:p>
         </w:tc>
@@ -4271,152 +4031,64 @@
                 <w:sz w:val="20"/>
                 <w:szCs w:val="20"/>
               </w:rPr>
-              <w:t>10</w:t>
-            </w:r>
-          </w:p>
-        </w:tc>
-        <w:tc>
-          <w:tcPr>
-            <w:tcW w:w="2340" w:type="dxa"/>
-            <w:vAlign w:val="center"/>
-          </w:tcPr>
-          <w:p>
-            <w:pPr>
-              <w:pStyle w:val="15"/>
-              <w:spacing w:before="0" w:after="0" w:line="240" w:lineRule="auto"/>
-            </w:pPr>
-            <w:r>
-              <w:rPr>
-                <w:sz w:val="20"/>
-                <w:szCs w:val="20"/>
-              </w:rPr>
-              <w:t>Anticancer (alternative)</w:t>
-            </w:r>
-          </w:p>
-        </w:tc>
-        <w:tc>
-          <w:tcPr>
-            <w:tcW w:w="2340" w:type="dxa"/>
-            <w:vAlign w:val="center"/>
-          </w:tcPr>
-          <w:p>
-            <w:pPr>
-              <w:pStyle w:val="15"/>
-              <w:spacing w:before="0" w:after="0" w:line="240" w:lineRule="auto"/>
-            </w:pPr>
-            <w:r>
-              <w:rPr>
-                <w:sz w:val="20"/>
-                <w:szCs w:val="20"/>
-              </w:rPr>
-              <w:t>1,979,643</w:t>
-            </w:r>
-          </w:p>
-        </w:tc>
-        <w:tc>
-          <w:tcPr>
-            <w:tcW w:w="2340" w:type="dxa"/>
-            <w:vAlign w:val="center"/>
-          </w:tcPr>
-          <w:p>
-            <w:pPr>
-              <w:pStyle w:val="15"/>
-              <w:spacing w:before="0" w:after="0" w:line="240" w:lineRule="auto"/>
-            </w:pPr>
-            <w:r>
-              <w:rPr>
-                <w:sz w:val="20"/>
-                <w:szCs w:val="20"/>
-              </w:rPr>
-              <w:t>17.57</w:t>
-            </w:r>
-          </w:p>
-        </w:tc>
-      </w:tr>
-      <w:tr>
-        <w:tblPrEx>
-          <w:tblBorders>
-            <w:top w:val="single" w:color="000000" w:sz="12" w:space="0"/>
-            <w:left w:val="none" w:color="auto" w:sz="0" w:space="0"/>
-            <w:bottom w:val="single" w:color="000000" w:sz="12" w:space="0"/>
-            <w:right w:val="none" w:color="auto" w:sz="0" w:space="0"/>
-            <w:insideH w:val="none" w:color="auto" w:sz="0" w:space="0"/>
-            <w:insideV w:val="none" w:color="auto" w:sz="0" w:space="0"/>
-          </w:tblBorders>
-        </w:tblPrEx>
-        <w:tc>
-          <w:tcPr>
-            <w:tcW w:w="2340" w:type="dxa"/>
-            <w:vAlign w:val="center"/>
-          </w:tcPr>
-          <w:p>
-            <w:pPr>
-              <w:pStyle w:val="15"/>
-              <w:spacing w:before="0" w:after="0" w:line="240" w:lineRule="auto"/>
-            </w:pPr>
-            <w:r>
-              <w:rPr>
-                <w:sz w:val="20"/>
-                <w:szCs w:val="20"/>
-              </w:rPr>
-              <w:t>11</w:t>
-            </w:r>
-          </w:p>
-        </w:tc>
-        <w:tc>
-          <w:tcPr>
-            <w:tcW w:w="2340" w:type="dxa"/>
-            <w:vAlign w:val="center"/>
-          </w:tcPr>
-          <w:p>
-            <w:pPr>
-              <w:pStyle w:val="15"/>
-              <w:spacing w:before="0" w:after="0" w:line="240" w:lineRule="auto"/>
-            </w:pPr>
-            <w:r>
-              <w:rPr>
-                <w:sz w:val="20"/>
-                <w:szCs w:val="20"/>
-              </w:rPr>
-              <w:t>Anti-MRSA</w:t>
-            </w:r>
-          </w:p>
-        </w:tc>
-        <w:tc>
-          <w:tcPr>
-            <w:tcW w:w="2340" w:type="dxa"/>
-            <w:vAlign w:val="center"/>
-          </w:tcPr>
-          <w:p>
-            <w:pPr>
-              <w:pStyle w:val="15"/>
-              <w:spacing w:before="0" w:after="0" w:line="240" w:lineRule="auto"/>
-            </w:pPr>
-            <w:r>
-              <w:rPr>
-                <w:sz w:val="20"/>
-                <w:szCs w:val="20"/>
-              </w:rPr>
-              <w:t>769,955</w:t>
-            </w:r>
-          </w:p>
-        </w:tc>
-        <w:tc>
-          <w:tcPr>
-            <w:tcW w:w="2340" w:type="dxa"/>
-            <w:vAlign w:val="center"/>
-          </w:tcPr>
-          <w:p>
-            <w:pPr>
-              <w:pStyle w:val="15"/>
-              <w:spacing w:before="0" w:after="0" w:line="240" w:lineRule="auto"/>
-            </w:pPr>
-            <w:r>
-              <w:rPr>
-                <w:sz w:val="20"/>
-                <w:szCs w:val="20"/>
-              </w:rPr>
-              <w:t>6.83</w:t>
+              <w:t>7</w:t>
+            </w:r>
+          </w:p>
+        </w:tc>
+        <w:tc>
+          <w:tcPr>
+            <w:tcW w:w="2340" w:type="dxa"/>
+            <w:vAlign w:val="center"/>
+          </w:tcPr>
+          <w:p>
+            <w:pPr>
+              <w:pStyle w:val="15"/>
+              <w:spacing w:before="0" w:after="0" w:line="240" w:lineRule="auto"/>
+            </w:pPr>
+            <w:r>
+              <w:rPr>
+                <w:sz w:val="20"/>
+                <w:szCs w:val="20"/>
+              </w:rPr>
+              <w:t>Antimalarial (main)</w:t>
+            </w:r>
+          </w:p>
+        </w:tc>
+        <w:tc>
+          <w:tcPr>
+            <w:tcW w:w="2340" w:type="dxa"/>
+            <w:vAlign w:val="center"/>
+          </w:tcPr>
+          <w:p>
+            <w:pPr>
+              <w:pStyle w:val="15"/>
+              <w:spacing w:before="0" w:after="0" w:line="240" w:lineRule="auto"/>
+            </w:pPr>
+            <w:r>
+              <w:rPr>
+                <w:sz w:val="20"/>
+                <w:szCs w:val="20"/>
+              </w:rPr>
+              <w:t>1,954,667</w:t>
+            </w:r>
+          </w:p>
+        </w:tc>
+        <w:tc>
+          <w:tcPr>
+            <w:tcW w:w="2340" w:type="dxa"/>
+            <w:vAlign w:val="center"/>
+          </w:tcPr>
+          <w:p>
+            <w:pPr>
+              <w:pStyle w:val="15"/>
+              <w:spacing w:before="0" w:after="0" w:line="240" w:lineRule="auto"/>
+            </w:pPr>
+            <w:r>
+              <w:rPr>
+                <w:sz w:val="20"/>
+                <w:szCs w:val="20"/>
+              </w:rPr>
+              <w:t>17.34</w:t>
             </w:r>
           </w:p>
         </w:tc>
@@ -4453,64 +4125,64 @@
                 <w:sz w:val="20"/>
                 <w:szCs w:val="20"/>
               </w:rPr>
-              <w:t>12</w:t>
-            </w:r>
-          </w:p>
-        </w:tc>
-        <w:tc>
-          <w:tcPr>
-            <w:tcW w:w="2340" w:type="dxa"/>
-            <w:vAlign w:val="center"/>
-          </w:tcPr>
-          <w:p>
-            <w:pPr>
-              <w:pStyle w:val="15"/>
-              <w:spacing w:before="0" w:after="0" w:line="240" w:lineRule="auto"/>
-            </w:pPr>
-            <w:r>
-              <w:rPr>
-                <w:sz w:val="20"/>
-                <w:szCs w:val="20"/>
-              </w:rPr>
-              <w:t>TTCA</w:t>
-            </w:r>
-          </w:p>
-        </w:tc>
-        <w:tc>
-          <w:tcPr>
-            <w:tcW w:w="2340" w:type="dxa"/>
-            <w:vAlign w:val="center"/>
-          </w:tcPr>
-          <w:p>
-            <w:pPr>
-              <w:pStyle w:val="15"/>
-              <w:spacing w:before="0" w:after="0" w:line="240" w:lineRule="auto"/>
-            </w:pPr>
-            <w:r>
-              <w:rPr>
-                <w:sz w:val="20"/>
-                <w:szCs w:val="20"/>
-              </w:rPr>
-              <w:t>2,618,849</w:t>
-            </w:r>
-          </w:p>
-        </w:tc>
-        <w:tc>
-          <w:tcPr>
-            <w:tcW w:w="2340" w:type="dxa"/>
-            <w:vAlign w:val="center"/>
-          </w:tcPr>
-          <w:p>
-            <w:pPr>
-              <w:pStyle w:val="15"/>
-              <w:spacing w:before="0" w:after="0" w:line="240" w:lineRule="auto"/>
-            </w:pPr>
-            <w:r>
-              <w:rPr>
-                <w:sz w:val="20"/>
-                <w:szCs w:val="20"/>
-              </w:rPr>
-              <w:t>23.24</w:t>
+              <w:t>8</w:t>
+            </w:r>
+          </w:p>
+        </w:tc>
+        <w:tc>
+          <w:tcPr>
+            <w:tcW w:w="2340" w:type="dxa"/>
+            <w:vAlign w:val="center"/>
+          </w:tcPr>
+          <w:p>
+            <w:pPr>
+              <w:pStyle w:val="15"/>
+              <w:spacing w:before="0" w:after="0" w:line="240" w:lineRule="auto"/>
+            </w:pPr>
+            <w:r>
+              <w:rPr>
+                <w:sz w:val="20"/>
+                <w:szCs w:val="20"/>
+              </w:rPr>
+              <w:t>Quorum sensing</w:t>
+            </w:r>
+          </w:p>
+        </w:tc>
+        <w:tc>
+          <w:tcPr>
+            <w:tcW w:w="2340" w:type="dxa"/>
+            <w:vAlign w:val="center"/>
+          </w:tcPr>
+          <w:p>
+            <w:pPr>
+              <w:pStyle w:val="15"/>
+              <w:spacing w:before="0" w:after="0" w:line="240" w:lineRule="auto"/>
+            </w:pPr>
+            <w:r>
+              <w:rPr>
+                <w:sz w:val="20"/>
+                <w:szCs w:val="20"/>
+              </w:rPr>
+              <w:t>4,161,825</w:t>
+            </w:r>
+          </w:p>
+        </w:tc>
+        <w:tc>
+          <w:tcPr>
+            <w:tcW w:w="2340" w:type="dxa"/>
+            <w:vAlign w:val="center"/>
+          </w:tcPr>
+          <w:p>
+            <w:pPr>
+              <w:pStyle w:val="15"/>
+              <w:spacing w:before="0" w:after="0" w:line="240" w:lineRule="auto"/>
+            </w:pPr>
+            <w:r>
+              <w:rPr>
+                <w:sz w:val="20"/>
+                <w:szCs w:val="20"/>
+              </w:rPr>
+              <w:t>36.93</w:t>
             </w:r>
           </w:p>
         </w:tc>
@@ -4547,64 +4219,64 @@
                 <w:sz w:val="20"/>
                 <w:szCs w:val="20"/>
               </w:rPr>
-              <w:t>13</w:t>
-            </w:r>
-          </w:p>
-        </w:tc>
-        <w:tc>
-          <w:tcPr>
-            <w:tcW w:w="2340" w:type="dxa"/>
-            <w:vAlign w:val="center"/>
-          </w:tcPr>
-          <w:p>
-            <w:pPr>
-              <w:pStyle w:val="15"/>
-              <w:spacing w:before="0" w:after="0" w:line="240" w:lineRule="auto"/>
-            </w:pPr>
-            <w:r>
-              <w:rPr>
-                <w:sz w:val="20"/>
-                <w:szCs w:val="20"/>
-              </w:rPr>
-              <w:t>BBB (BBP)</w:t>
-            </w:r>
-          </w:p>
-        </w:tc>
-        <w:tc>
-          <w:tcPr>
-            <w:tcW w:w="2340" w:type="dxa"/>
-            <w:vAlign w:val="center"/>
-          </w:tcPr>
-          <w:p>
-            <w:pPr>
-              <w:pStyle w:val="15"/>
-              <w:spacing w:before="0" w:after="0" w:line="240" w:lineRule="auto"/>
-            </w:pPr>
-            <w:r>
-              <w:rPr>
-                <w:sz w:val="20"/>
-                <w:szCs w:val="20"/>
-              </w:rPr>
-              <w:t>1,095,861</w:t>
-            </w:r>
-          </w:p>
-        </w:tc>
-        <w:tc>
-          <w:tcPr>
-            <w:tcW w:w="2340" w:type="dxa"/>
-            <w:vAlign w:val="center"/>
-          </w:tcPr>
-          <w:p>
-            <w:pPr>
-              <w:pStyle w:val="15"/>
-              <w:spacing w:before="0" w:after="0" w:line="240" w:lineRule="auto"/>
-            </w:pPr>
-            <w:r>
-              <w:rPr>
-                <w:sz w:val="20"/>
-                <w:szCs w:val="20"/>
-              </w:rPr>
-              <w:t>9.72</w:t>
+              <w:t>9</w:t>
+            </w:r>
+          </w:p>
+        </w:tc>
+        <w:tc>
+          <w:tcPr>
+            <w:tcW w:w="2340" w:type="dxa"/>
+            <w:vAlign w:val="center"/>
+          </w:tcPr>
+          <w:p>
+            <w:pPr>
+              <w:pStyle w:val="15"/>
+              <w:spacing w:before="0" w:after="0" w:line="240" w:lineRule="auto"/>
+            </w:pPr>
+            <w:r>
+              <w:rPr>
+                <w:sz w:val="20"/>
+                <w:szCs w:val="20"/>
+              </w:rPr>
+              <w:t>Anticancer (main)</w:t>
+            </w:r>
+          </w:p>
+        </w:tc>
+        <w:tc>
+          <w:tcPr>
+            <w:tcW w:w="2340" w:type="dxa"/>
+            <w:vAlign w:val="center"/>
+          </w:tcPr>
+          <w:p>
+            <w:pPr>
+              <w:pStyle w:val="15"/>
+              <w:spacing w:before="0" w:after="0" w:line="240" w:lineRule="auto"/>
+            </w:pPr>
+            <w:r>
+              <w:rPr>
+                <w:sz w:val="20"/>
+                <w:szCs w:val="20"/>
+              </w:rPr>
+              <w:t>2,404,084</w:t>
+            </w:r>
+          </w:p>
+        </w:tc>
+        <w:tc>
+          <w:tcPr>
+            <w:tcW w:w="2340" w:type="dxa"/>
+            <w:vAlign w:val="center"/>
+          </w:tcPr>
+          <w:p>
+            <w:pPr>
+              <w:pStyle w:val="15"/>
+              <w:spacing w:before="0" w:after="0" w:line="240" w:lineRule="auto"/>
+            </w:pPr>
+            <w:r>
+              <w:rPr>
+                <w:sz w:val="20"/>
+                <w:szCs w:val="20"/>
+              </w:rPr>
+              <w:t>21.33</w:t>
             </w:r>
           </w:p>
         </w:tc>
@@ -4641,64 +4313,64 @@
                 <w:sz w:val="20"/>
                 <w:szCs w:val="20"/>
               </w:rPr>
-              <w:t>14</w:t>
-            </w:r>
-          </w:p>
-        </w:tc>
-        <w:tc>
-          <w:tcPr>
-            <w:tcW w:w="2340" w:type="dxa"/>
-            <w:vAlign w:val="center"/>
-          </w:tcPr>
-          <w:p>
-            <w:pPr>
-              <w:pStyle w:val="15"/>
-              <w:spacing w:before="0" w:after="0" w:line="240" w:lineRule="auto"/>
-            </w:pPr>
-            <w:r>
-              <w:rPr>
-                <w:sz w:val="20"/>
-                <w:szCs w:val="20"/>
-              </w:rPr>
-              <w:t>Anti-parasitic (APP)</w:t>
-            </w:r>
-          </w:p>
-        </w:tc>
-        <w:tc>
-          <w:tcPr>
-            <w:tcW w:w="2340" w:type="dxa"/>
-            <w:vAlign w:val="center"/>
-          </w:tcPr>
-          <w:p>
-            <w:pPr>
-              <w:pStyle w:val="15"/>
-              <w:spacing w:before="0" w:after="0" w:line="240" w:lineRule="auto"/>
-            </w:pPr>
-            <w:r>
-              <w:rPr>
-                <w:sz w:val="20"/>
-                <w:szCs w:val="20"/>
-              </w:rPr>
-              <w:t>5,517,278</w:t>
-            </w:r>
-          </w:p>
-        </w:tc>
-        <w:tc>
-          <w:tcPr>
-            <w:tcW w:w="2340" w:type="dxa"/>
-            <w:vAlign w:val="center"/>
-          </w:tcPr>
-          <w:p>
-            <w:pPr>
-              <w:pStyle w:val="15"/>
-              <w:spacing w:before="0" w:after="0" w:line="240" w:lineRule="auto"/>
-            </w:pPr>
-            <w:r>
-              <w:rPr>
-                <w:sz w:val="20"/>
-                <w:szCs w:val="20"/>
-              </w:rPr>
-              <w:t>48.96</w:t>
+              <w:t>10</w:t>
+            </w:r>
+          </w:p>
+        </w:tc>
+        <w:tc>
+          <w:tcPr>
+            <w:tcW w:w="2340" w:type="dxa"/>
+            <w:vAlign w:val="center"/>
+          </w:tcPr>
+          <w:p>
+            <w:pPr>
+              <w:pStyle w:val="15"/>
+              <w:spacing w:before="0" w:after="0" w:line="240" w:lineRule="auto"/>
+            </w:pPr>
+            <w:r>
+              <w:rPr>
+                <w:sz w:val="20"/>
+                <w:szCs w:val="20"/>
+              </w:rPr>
+              <w:t>Anticancer (alternative)</w:t>
+            </w:r>
+          </w:p>
+        </w:tc>
+        <w:tc>
+          <w:tcPr>
+            <w:tcW w:w="2340" w:type="dxa"/>
+            <w:vAlign w:val="center"/>
+          </w:tcPr>
+          <w:p>
+            <w:pPr>
+              <w:pStyle w:val="15"/>
+              <w:spacing w:before="0" w:after="0" w:line="240" w:lineRule="auto"/>
+            </w:pPr>
+            <w:r>
+              <w:rPr>
+                <w:sz w:val="20"/>
+                <w:szCs w:val="20"/>
+              </w:rPr>
+              <w:t>1,979,643</w:t>
+            </w:r>
+          </w:p>
+        </w:tc>
+        <w:tc>
+          <w:tcPr>
+            <w:tcW w:w="2340" w:type="dxa"/>
+            <w:vAlign w:val="center"/>
+          </w:tcPr>
+          <w:p>
+            <w:pPr>
+              <w:pStyle w:val="15"/>
+              <w:spacing w:before="0" w:after="0" w:line="240" w:lineRule="auto"/>
+            </w:pPr>
+            <w:r>
+              <w:rPr>
+                <w:sz w:val="20"/>
+                <w:szCs w:val="20"/>
+              </w:rPr>
+              <w:t>17.57</w:t>
             </w:r>
           </w:p>
         </w:tc>
@@ -4735,64 +4407,64 @@
                 <w:sz w:val="20"/>
                 <w:szCs w:val="20"/>
               </w:rPr>
-              <w:t>15</w:t>
-            </w:r>
-          </w:p>
-        </w:tc>
-        <w:tc>
-          <w:tcPr>
-            <w:tcW w:w="2340" w:type="dxa"/>
-            <w:vAlign w:val="center"/>
-          </w:tcPr>
-          <w:p>
-            <w:pPr>
-              <w:pStyle w:val="15"/>
-              <w:spacing w:before="0" w:after="0" w:line="240" w:lineRule="auto"/>
-            </w:pPr>
-            <w:r>
-              <w:rPr>
-                <w:sz w:val="20"/>
-                <w:szCs w:val="20"/>
-              </w:rPr>
-              <w:t>NeuroPred</w:t>
-            </w:r>
-          </w:p>
-        </w:tc>
-        <w:tc>
-          <w:tcPr>
-            <w:tcW w:w="2340" w:type="dxa"/>
-            <w:vAlign w:val="center"/>
-          </w:tcPr>
-          <w:p>
-            <w:pPr>
-              <w:pStyle w:val="15"/>
-              <w:spacing w:before="0" w:after="0" w:line="240" w:lineRule="auto"/>
-            </w:pPr>
-            <w:r>
-              <w:rPr>
-                <w:sz w:val="20"/>
-                <w:szCs w:val="20"/>
-              </w:rPr>
-              <w:t>1,690,436</w:t>
-            </w:r>
-          </w:p>
-        </w:tc>
-        <w:tc>
-          <w:tcPr>
-            <w:tcW w:w="2340" w:type="dxa"/>
-            <w:vAlign w:val="center"/>
-          </w:tcPr>
-          <w:p>
-            <w:pPr>
-              <w:pStyle w:val="15"/>
-              <w:spacing w:before="0" w:after="0" w:line="240" w:lineRule="auto"/>
-            </w:pPr>
-            <w:r>
-              <w:rPr>
-                <w:sz w:val="20"/>
-                <w:szCs w:val="20"/>
-              </w:rPr>
-              <w:t>15.00</w:t>
+              <w:t>11</w:t>
+            </w:r>
+          </w:p>
+        </w:tc>
+        <w:tc>
+          <w:tcPr>
+            <w:tcW w:w="2340" w:type="dxa"/>
+            <w:vAlign w:val="center"/>
+          </w:tcPr>
+          <w:p>
+            <w:pPr>
+              <w:pStyle w:val="15"/>
+              <w:spacing w:before="0" w:after="0" w:line="240" w:lineRule="auto"/>
+            </w:pPr>
+            <w:r>
+              <w:rPr>
+                <w:sz w:val="20"/>
+                <w:szCs w:val="20"/>
+              </w:rPr>
+              <w:t>Anti-MRSA</w:t>
+            </w:r>
+          </w:p>
+        </w:tc>
+        <w:tc>
+          <w:tcPr>
+            <w:tcW w:w="2340" w:type="dxa"/>
+            <w:vAlign w:val="center"/>
+          </w:tcPr>
+          <w:p>
+            <w:pPr>
+              <w:pStyle w:val="15"/>
+              <w:spacing w:before="0" w:after="0" w:line="240" w:lineRule="auto"/>
+            </w:pPr>
+            <w:r>
+              <w:rPr>
+                <w:sz w:val="20"/>
+                <w:szCs w:val="20"/>
+              </w:rPr>
+              <w:t>769,955</w:t>
+            </w:r>
+          </w:p>
+        </w:tc>
+        <w:tc>
+          <w:tcPr>
+            <w:tcW w:w="2340" w:type="dxa"/>
+            <w:vAlign w:val="center"/>
+          </w:tcPr>
+          <w:p>
+            <w:pPr>
+              <w:pStyle w:val="15"/>
+              <w:spacing w:before="0" w:after="0" w:line="240" w:lineRule="auto"/>
+            </w:pPr>
+            <w:r>
+              <w:rPr>
+                <w:sz w:val="20"/>
+                <w:szCs w:val="20"/>
+              </w:rPr>
+              <w:t>6.83</w:t>
             </w:r>
           </w:p>
         </w:tc>
@@ -4807,6 +4479,388 @@
             <w:insideH w:val="none" w:color="auto" w:sz="0" w:space="0"/>
             <w:insideV w:val="none" w:color="auto" w:sz="0" w:space="0"/>
           </w:tblBorders>
+          <w:tblCellMar>
+            <w:top w:w="70" w:type="dxa"/>
+            <w:left w:w="80" w:type="dxa"/>
+            <w:bottom w:w="70" w:type="dxa"/>
+            <w:right w:w="80" w:type="dxa"/>
+          </w:tblCellMar>
+        </w:tblPrEx>
+        <w:tc>
+          <w:tcPr>
+            <w:tcW w:w="2340" w:type="dxa"/>
+            <w:vAlign w:val="center"/>
+          </w:tcPr>
+          <w:p>
+            <w:pPr>
+              <w:pStyle w:val="15"/>
+              <w:spacing w:before="0" w:after="0" w:line="240" w:lineRule="auto"/>
+            </w:pPr>
+            <w:r>
+              <w:rPr>
+                <w:sz w:val="20"/>
+                <w:szCs w:val="20"/>
+              </w:rPr>
+              <w:t>12</w:t>
+            </w:r>
+          </w:p>
+        </w:tc>
+        <w:tc>
+          <w:tcPr>
+            <w:tcW w:w="2340" w:type="dxa"/>
+            <w:vAlign w:val="center"/>
+          </w:tcPr>
+          <w:p>
+            <w:pPr>
+              <w:pStyle w:val="15"/>
+              <w:spacing w:before="0" w:after="0" w:line="240" w:lineRule="auto"/>
+            </w:pPr>
+            <w:r>
+              <w:rPr>
+                <w:sz w:val="20"/>
+                <w:szCs w:val="20"/>
+              </w:rPr>
+              <w:t>TTCA</w:t>
+            </w:r>
+          </w:p>
+        </w:tc>
+        <w:tc>
+          <w:tcPr>
+            <w:tcW w:w="2340" w:type="dxa"/>
+            <w:vAlign w:val="center"/>
+          </w:tcPr>
+          <w:p>
+            <w:pPr>
+              <w:pStyle w:val="15"/>
+              <w:spacing w:before="0" w:after="0" w:line="240" w:lineRule="auto"/>
+            </w:pPr>
+            <w:r>
+              <w:rPr>
+                <w:sz w:val="20"/>
+                <w:szCs w:val="20"/>
+              </w:rPr>
+              <w:t>2,618,849</w:t>
+            </w:r>
+          </w:p>
+        </w:tc>
+        <w:tc>
+          <w:tcPr>
+            <w:tcW w:w="2340" w:type="dxa"/>
+            <w:vAlign w:val="center"/>
+          </w:tcPr>
+          <w:p>
+            <w:pPr>
+              <w:pStyle w:val="15"/>
+              <w:spacing w:before="0" w:after="0" w:line="240" w:lineRule="auto"/>
+            </w:pPr>
+            <w:r>
+              <w:rPr>
+                <w:sz w:val="20"/>
+                <w:szCs w:val="20"/>
+              </w:rPr>
+              <w:t>23.24</w:t>
+            </w:r>
+          </w:p>
+        </w:tc>
+      </w:tr>
+      <w:tr>
+        <w:tblPrEx>
+          <w:tblBorders>
+            <w:top w:val="single" w:color="000000" w:sz="12" w:space="0"/>
+            <w:left w:val="none" w:color="auto" w:sz="0" w:space="0"/>
+            <w:bottom w:val="single" w:color="000000" w:sz="12" w:space="0"/>
+            <w:right w:val="none" w:color="auto" w:sz="0" w:space="0"/>
+            <w:insideH w:val="none" w:color="auto" w:sz="0" w:space="0"/>
+            <w:insideV w:val="none" w:color="auto" w:sz="0" w:space="0"/>
+          </w:tblBorders>
+          <w:tblCellMar>
+            <w:top w:w="70" w:type="dxa"/>
+            <w:left w:w="80" w:type="dxa"/>
+            <w:bottom w:w="70" w:type="dxa"/>
+            <w:right w:w="80" w:type="dxa"/>
+          </w:tblCellMar>
+        </w:tblPrEx>
+        <w:tc>
+          <w:tcPr>
+            <w:tcW w:w="2340" w:type="dxa"/>
+            <w:vAlign w:val="center"/>
+          </w:tcPr>
+          <w:p>
+            <w:pPr>
+              <w:pStyle w:val="15"/>
+              <w:spacing w:before="0" w:after="0" w:line="240" w:lineRule="auto"/>
+            </w:pPr>
+            <w:r>
+              <w:rPr>
+                <w:sz w:val="20"/>
+                <w:szCs w:val="20"/>
+              </w:rPr>
+              <w:t>13</w:t>
+            </w:r>
+          </w:p>
+        </w:tc>
+        <w:tc>
+          <w:tcPr>
+            <w:tcW w:w="2340" w:type="dxa"/>
+            <w:vAlign w:val="center"/>
+          </w:tcPr>
+          <w:p>
+            <w:pPr>
+              <w:pStyle w:val="15"/>
+              <w:spacing w:before="0" w:after="0" w:line="240" w:lineRule="auto"/>
+            </w:pPr>
+            <w:r>
+              <w:rPr>
+                <w:sz w:val="20"/>
+                <w:szCs w:val="20"/>
+              </w:rPr>
+              <w:t>BBB (BBP)</w:t>
+            </w:r>
+          </w:p>
+        </w:tc>
+        <w:tc>
+          <w:tcPr>
+            <w:tcW w:w="2340" w:type="dxa"/>
+            <w:vAlign w:val="center"/>
+          </w:tcPr>
+          <w:p>
+            <w:pPr>
+              <w:pStyle w:val="15"/>
+              <w:spacing w:before="0" w:after="0" w:line="240" w:lineRule="auto"/>
+            </w:pPr>
+            <w:r>
+              <w:rPr>
+                <w:sz w:val="20"/>
+                <w:szCs w:val="20"/>
+              </w:rPr>
+              <w:t>1,095,861</w:t>
+            </w:r>
+          </w:p>
+        </w:tc>
+        <w:tc>
+          <w:tcPr>
+            <w:tcW w:w="2340" w:type="dxa"/>
+            <w:vAlign w:val="center"/>
+          </w:tcPr>
+          <w:p>
+            <w:pPr>
+              <w:pStyle w:val="15"/>
+              <w:spacing w:before="0" w:after="0" w:line="240" w:lineRule="auto"/>
+            </w:pPr>
+            <w:r>
+              <w:rPr>
+                <w:sz w:val="20"/>
+                <w:szCs w:val="20"/>
+              </w:rPr>
+              <w:t>9.72</w:t>
+            </w:r>
+          </w:p>
+        </w:tc>
+      </w:tr>
+      <w:tr>
+        <w:tblPrEx>
+          <w:tblBorders>
+            <w:top w:val="single" w:color="000000" w:sz="12" w:space="0"/>
+            <w:left w:val="none" w:color="auto" w:sz="0" w:space="0"/>
+            <w:bottom w:val="single" w:color="000000" w:sz="12" w:space="0"/>
+            <w:right w:val="none" w:color="auto" w:sz="0" w:space="0"/>
+            <w:insideH w:val="none" w:color="auto" w:sz="0" w:space="0"/>
+            <w:insideV w:val="none" w:color="auto" w:sz="0" w:space="0"/>
+          </w:tblBorders>
+          <w:tblCellMar>
+            <w:top w:w="70" w:type="dxa"/>
+            <w:left w:w="80" w:type="dxa"/>
+            <w:bottom w:w="70" w:type="dxa"/>
+            <w:right w:w="80" w:type="dxa"/>
+          </w:tblCellMar>
+        </w:tblPrEx>
+        <w:tc>
+          <w:tcPr>
+            <w:tcW w:w="2340" w:type="dxa"/>
+            <w:vAlign w:val="center"/>
+          </w:tcPr>
+          <w:p>
+            <w:pPr>
+              <w:pStyle w:val="15"/>
+              <w:spacing w:before="0" w:after="0" w:line="240" w:lineRule="auto"/>
+            </w:pPr>
+            <w:r>
+              <w:rPr>
+                <w:sz w:val="20"/>
+                <w:szCs w:val="20"/>
+              </w:rPr>
+              <w:t>14</w:t>
+            </w:r>
+          </w:p>
+        </w:tc>
+        <w:tc>
+          <w:tcPr>
+            <w:tcW w:w="2340" w:type="dxa"/>
+            <w:vAlign w:val="center"/>
+          </w:tcPr>
+          <w:p>
+            <w:pPr>
+              <w:pStyle w:val="15"/>
+              <w:spacing w:before="0" w:after="0" w:line="240" w:lineRule="auto"/>
+            </w:pPr>
+            <w:r>
+              <w:rPr>
+                <w:sz w:val="20"/>
+                <w:szCs w:val="20"/>
+              </w:rPr>
+              <w:t>Anti-parasitic (APP)</w:t>
+            </w:r>
+          </w:p>
+        </w:tc>
+        <w:tc>
+          <w:tcPr>
+            <w:tcW w:w="2340" w:type="dxa"/>
+            <w:vAlign w:val="center"/>
+          </w:tcPr>
+          <w:p>
+            <w:pPr>
+              <w:pStyle w:val="15"/>
+              <w:spacing w:before="0" w:after="0" w:line="240" w:lineRule="auto"/>
+            </w:pPr>
+            <w:r>
+              <w:rPr>
+                <w:sz w:val="20"/>
+                <w:szCs w:val="20"/>
+              </w:rPr>
+              <w:t>5,517,278</w:t>
+            </w:r>
+          </w:p>
+        </w:tc>
+        <w:tc>
+          <w:tcPr>
+            <w:tcW w:w="2340" w:type="dxa"/>
+            <w:vAlign w:val="center"/>
+          </w:tcPr>
+          <w:p>
+            <w:pPr>
+              <w:pStyle w:val="15"/>
+              <w:spacing w:before="0" w:after="0" w:line="240" w:lineRule="auto"/>
+            </w:pPr>
+            <w:r>
+              <w:rPr>
+                <w:sz w:val="20"/>
+                <w:szCs w:val="20"/>
+              </w:rPr>
+              <w:t>48.96</w:t>
+            </w:r>
+          </w:p>
+        </w:tc>
+      </w:tr>
+      <w:tr>
+        <w:tblPrEx>
+          <w:tblBorders>
+            <w:top w:val="single" w:color="000000" w:sz="12" w:space="0"/>
+            <w:left w:val="none" w:color="auto" w:sz="0" w:space="0"/>
+            <w:bottom w:val="single" w:color="000000" w:sz="12" w:space="0"/>
+            <w:right w:val="none" w:color="auto" w:sz="0" w:space="0"/>
+            <w:insideH w:val="none" w:color="auto" w:sz="0" w:space="0"/>
+            <w:insideV w:val="none" w:color="auto" w:sz="0" w:space="0"/>
+          </w:tblBorders>
+          <w:tblCellMar>
+            <w:top w:w="70" w:type="dxa"/>
+            <w:left w:w="80" w:type="dxa"/>
+            <w:bottom w:w="70" w:type="dxa"/>
+            <w:right w:w="80" w:type="dxa"/>
+          </w:tblCellMar>
+        </w:tblPrEx>
+        <w:tc>
+          <w:tcPr>
+            <w:tcW w:w="2340" w:type="dxa"/>
+            <w:vAlign w:val="center"/>
+          </w:tcPr>
+          <w:p>
+            <w:pPr>
+              <w:pStyle w:val="15"/>
+              <w:spacing w:before="0" w:after="0" w:line="240" w:lineRule="auto"/>
+            </w:pPr>
+            <w:r>
+              <w:rPr>
+                <w:sz w:val="20"/>
+                <w:szCs w:val="20"/>
+              </w:rPr>
+              <w:t>15</w:t>
+            </w:r>
+          </w:p>
+        </w:tc>
+        <w:tc>
+          <w:tcPr>
+            <w:tcW w:w="2340" w:type="dxa"/>
+            <w:vAlign w:val="center"/>
+          </w:tcPr>
+          <w:p>
+            <w:pPr>
+              <w:pStyle w:val="15"/>
+              <w:spacing w:before="0" w:after="0" w:line="240" w:lineRule="auto"/>
+            </w:pPr>
+            <w:r>
+              <w:rPr>
+                <w:sz w:val="20"/>
+                <w:szCs w:val="20"/>
+              </w:rPr>
+              <w:t>NeuroPred</w:t>
+            </w:r>
+          </w:p>
+        </w:tc>
+        <w:tc>
+          <w:tcPr>
+            <w:tcW w:w="2340" w:type="dxa"/>
+            <w:vAlign w:val="center"/>
+          </w:tcPr>
+          <w:p>
+            <w:pPr>
+              <w:pStyle w:val="15"/>
+              <w:spacing w:before="0" w:after="0" w:line="240" w:lineRule="auto"/>
+            </w:pPr>
+            <w:r>
+              <w:rPr>
+                <w:sz w:val="20"/>
+                <w:szCs w:val="20"/>
+              </w:rPr>
+              <w:t>1,690,436</w:t>
+            </w:r>
+          </w:p>
+        </w:tc>
+        <w:tc>
+          <w:tcPr>
+            <w:tcW w:w="2340" w:type="dxa"/>
+            <w:vAlign w:val="center"/>
+          </w:tcPr>
+          <w:p>
+            <w:pPr>
+              <w:pStyle w:val="15"/>
+              <w:spacing w:before="0" w:after="0" w:line="240" w:lineRule="auto"/>
+            </w:pPr>
+            <w:r>
+              <w:rPr>
+                <w:sz w:val="20"/>
+                <w:szCs w:val="20"/>
+              </w:rPr>
+              <w:t>15.00</w:t>
+            </w:r>
+          </w:p>
+        </w:tc>
+      </w:tr>
+      <w:tr>
+        <w:tblPrEx>
+          <w:tblBorders>
+            <w:top w:val="single" w:color="000000" w:sz="12" w:space="0"/>
+            <w:left w:val="none" w:color="auto" w:sz="0" w:space="0"/>
+            <w:bottom w:val="single" w:color="000000" w:sz="12" w:space="0"/>
+            <w:right w:val="none" w:color="auto" w:sz="0" w:space="0"/>
+            <w:insideH w:val="none" w:color="auto" w:sz="0" w:space="0"/>
+            <w:insideV w:val="none" w:color="auto" w:sz="0" w:space="0"/>
+          </w:tblBorders>
+          <w:tblCellMar>
+            <w:top w:w="70" w:type="dxa"/>
+            <w:left w:w="80" w:type="dxa"/>
+            <w:bottom w:w="70" w:type="dxa"/>
+            <w:right w:w="80" w:type="dxa"/>
+          </w:tblCellMar>
         </w:tblPrEx>
         <w:tc>
           <w:tcPr>
@@ -5612,12 +5666,6 @@
             <w:insideH w:val="none" w:color="auto" w:sz="0" w:space="0"/>
             <w:insideV w:val="none" w:color="auto" w:sz="0" w:space="0"/>
           </w:tblBorders>
-          <w:tblCellMar>
-            <w:top w:w="70" w:type="dxa"/>
-            <w:left w:w="80" w:type="dxa"/>
-            <w:bottom w:w="70" w:type="dxa"/>
-            <w:right w:w="80" w:type="dxa"/>
-          </w:tblCellMar>
         </w:tblPrEx>
         <w:tc>
           <w:tcPr>
@@ -5800,6 +5848,12 @@
             <w:insideH w:val="none" w:color="auto" w:sz="0" w:space="0"/>
             <w:insideV w:val="none" w:color="auto" w:sz="0" w:space="0"/>
           </w:tblBorders>
+          <w:tblCellMar>
+            <w:top w:w="70" w:type="dxa"/>
+            <w:left w:w="80" w:type="dxa"/>
+            <w:bottom w:w="70" w:type="dxa"/>
+            <w:right w:w="80" w:type="dxa"/>
+          </w:tblCellMar>
         </w:tblPrEx>
         <w:tc>
           <w:tcPr>
@@ -6870,12 +6924,6 @@
             <w:insideH w:val="none" w:color="auto" w:sz="0" w:space="0"/>
             <w:insideV w:val="none" w:color="auto" w:sz="0" w:space="0"/>
           </w:tblBorders>
-          <w:tblCellMar>
-            <w:top w:w="70" w:type="dxa"/>
-            <w:left w:w="80" w:type="dxa"/>
-            <w:bottom w:w="70" w:type="dxa"/>
-            <w:right w:w="80" w:type="dxa"/>
-          </w:tblCellMar>
         </w:tblPrEx>
         <w:tc>
           <w:tcPr>
@@ -9260,12 +9308,6 @@
             <w:insideH w:val="none" w:color="auto" w:sz="0" w:space="0"/>
             <w:insideV w:val="none" w:color="auto" w:sz="0" w:space="0"/>
           </w:tblBorders>
-          <w:tblCellMar>
-            <w:top w:w="70" w:type="dxa"/>
-            <w:left w:w="80" w:type="dxa"/>
-            <w:bottom w:w="70" w:type="dxa"/>
-            <w:right w:w="80" w:type="dxa"/>
-          </w:tblCellMar>
         </w:tblPrEx>
         <w:tc>
           <w:tcPr>
@@ -13195,6 +13237,12 @@
             <w:insideH w:val="none" w:color="auto" w:sz="0" w:space="0"/>
             <w:insideV w:val="none" w:color="auto" w:sz="0" w:space="0"/>
           </w:tblBorders>
+          <w:tblCellMar>
+            <w:top w:w="70" w:type="dxa"/>
+            <w:left w:w="80" w:type="dxa"/>
+            <w:bottom w:w="70" w:type="dxa"/>
+            <w:right w:w="80" w:type="dxa"/>
+          </w:tblCellMar>
         </w:tblPrEx>
         <w:tc>
           <w:tcPr>
@@ -13415,12 +13463,6 @@
             <w:insideH w:val="none" w:color="auto" w:sz="0" w:space="0"/>
             <w:insideV w:val="none" w:color="auto" w:sz="0" w:space="0"/>
           </w:tblBorders>
-          <w:tblCellMar>
-            <w:top w:w="70" w:type="dxa"/>
-            <w:left w:w="80" w:type="dxa"/>
-            <w:bottom w:w="70" w:type="dxa"/>
-            <w:right w:w="80" w:type="dxa"/>
-          </w:tblCellMar>
         </w:tblPrEx>
         <w:tc>
           <w:tcPr>
@@ -13748,12 +13790,6 @@
             <w:insideH w:val="none" w:color="auto" w:sz="0" w:space="0"/>
             <w:insideV w:val="none" w:color="auto" w:sz="0" w:space="0"/>
           </w:tblBorders>
-          <w:tblCellMar>
-            <w:top w:w="70" w:type="dxa"/>
-            <w:left w:w="80" w:type="dxa"/>
-            <w:bottom w:w="70" w:type="dxa"/>
-            <w:right w:w="80" w:type="dxa"/>
-          </w:tblCellMar>
         </w:tblPrEx>
         <w:tc>
           <w:tcPr>
@@ -17059,6 +17095,7 @@
   <w:style w:type="paragraph" w:customStyle="1" w:styleId="11">
     <w:name w:val="Keywords"/>
     <w:basedOn w:val="1"/>
+    <w:qFormat/>
     <w:uiPriority w:val="0"/>
     <w:pPr>
       <w:spacing w:after="120" w:line="480" w:lineRule="auto"/>

</xml_diff>

<commit_message>
local: auto 20261013-161046 (1 file(s))
</commit_message>
<xml_diff>
--- a/projects/English.docx
+++ b/projects/English.docx
@@ -43,8 +43,6 @@
       <w:r>
         <w:t>Deep-learning screening, molecular docking and molecular dynamics of periodontitis oral micropeptides targeting human acetylcholinesterase</w:t>
       </w:r>
-      <w:bookmarkStart w:id="0" w:name="_GoBack"/>
-      <w:bookmarkEnd w:id="0"/>
       <w:r>
         <w:rPr>
           <w:rFonts w:hint="eastAsia"/>
@@ -101,6 +99,21 @@
     <w:p>
       <w:pPr>
         <w:rPr>
+          <w:rFonts w:hint="eastAsia"/>
+          <w:lang w:val="en-US" w:eastAsia="zh-CN"/>
+        </w:rPr>
+      </w:pPr>
+      <w:r>
+        <w:rPr>
+          <w:rFonts w:hint="eastAsia"/>
+          <w:lang w:val="en-US" w:eastAsia="zh-CN"/>
+        </w:rPr>
+        <w:t>Aβ聚集实验 神经毒性的肽pc12</w:t>
+      </w:r>
+    </w:p>
+    <w:p>
+      <w:pPr>
+        <w:rPr>
           <w:rFonts w:hint="default"/>
           <w:lang w:val="en-US" w:eastAsia="zh-CN"/>
         </w:rPr>
@@ -110,8 +123,17 @@
           <w:rFonts w:hint="eastAsia"/>
           <w:lang w:val="en-US" w:eastAsia="zh-CN"/>
         </w:rPr>
-        <w:t>Aβ聚集实验 神经毒性的肽pc12</w:t>
-      </w:r>
+        <w:br w:type="textWrapping"/>
+      </w:r>
+      <w:r>
+        <w:rPr>
+          <w:rFonts w:hint="eastAsia"/>
+          <w:lang w:val="en-US" w:eastAsia="zh-CN"/>
+        </w:rPr>
+        <w:t>找Aβ聚集的肽的文献</w:t>
+      </w:r>
+      <w:bookmarkStart w:id="0" w:name="_GoBack"/>
+      <w:bookmarkEnd w:id="0"/>
     </w:p>
     <w:p>
       <w:pPr>
@@ -2552,6 +2574,12 @@
             <w:insideH w:val="none" w:color="auto" w:sz="0" w:space="0"/>
             <w:insideV w:val="none" w:color="auto" w:sz="0" w:space="0"/>
           </w:tblBorders>
+          <w:tblCellMar>
+            <w:top w:w="70" w:type="dxa"/>
+            <w:left w:w="80" w:type="dxa"/>
+            <w:bottom w:w="70" w:type="dxa"/>
+            <w:right w:w="80" w:type="dxa"/>
+          </w:tblCellMar>
         </w:tblPrEx>
         <w:tc>
           <w:tcPr>
@@ -2734,6 +2762,12 @@
             <w:insideH w:val="none" w:color="auto" w:sz="0" w:space="0"/>
             <w:insideV w:val="none" w:color="auto" w:sz="0" w:space="0"/>
           </w:tblBorders>
+          <w:tblCellMar>
+            <w:top w:w="70" w:type="dxa"/>
+            <w:left w:w="80" w:type="dxa"/>
+            <w:bottom w:w="70" w:type="dxa"/>
+            <w:right w:w="80" w:type="dxa"/>
+          </w:tblCellMar>
         </w:tblPrEx>
         <w:tc>
           <w:tcPr>
@@ -3104,12 +3138,6 @@
             <w:insideH w:val="none" w:color="auto" w:sz="0" w:space="0"/>
             <w:insideV w:val="none" w:color="auto" w:sz="0" w:space="0"/>
           </w:tblBorders>
-          <w:tblCellMar>
-            <w:top w:w="70" w:type="dxa"/>
-            <w:left w:w="80" w:type="dxa"/>
-            <w:bottom w:w="70" w:type="dxa"/>
-            <w:right w:w="80" w:type="dxa"/>
-          </w:tblCellMar>
         </w:tblPrEx>
         <w:tc>
           <w:tcPr>
@@ -5666,6 +5694,12 @@
             <w:insideH w:val="none" w:color="auto" w:sz="0" w:space="0"/>
             <w:insideV w:val="none" w:color="auto" w:sz="0" w:space="0"/>
           </w:tblBorders>
+          <w:tblCellMar>
+            <w:top w:w="70" w:type="dxa"/>
+            <w:left w:w="80" w:type="dxa"/>
+            <w:bottom w:w="70" w:type="dxa"/>
+            <w:right w:w="80" w:type="dxa"/>
+          </w:tblCellMar>
         </w:tblPrEx>
         <w:tc>
           <w:tcPr>
@@ -6924,6 +6958,12 @@
             <w:insideH w:val="none" w:color="auto" w:sz="0" w:space="0"/>
             <w:insideV w:val="none" w:color="auto" w:sz="0" w:space="0"/>
           </w:tblBorders>
+          <w:tblCellMar>
+            <w:top w:w="70" w:type="dxa"/>
+            <w:left w:w="80" w:type="dxa"/>
+            <w:bottom w:w="70" w:type="dxa"/>
+            <w:right w:w="80" w:type="dxa"/>
+          </w:tblCellMar>
         </w:tblPrEx>
         <w:tc>
           <w:tcPr>
@@ -9308,6 +9348,12 @@
             <w:insideH w:val="none" w:color="auto" w:sz="0" w:space="0"/>
             <w:insideV w:val="none" w:color="auto" w:sz="0" w:space="0"/>
           </w:tblBorders>
+          <w:tblCellMar>
+            <w:top w:w="70" w:type="dxa"/>
+            <w:left w:w="80" w:type="dxa"/>
+            <w:bottom w:w="70" w:type="dxa"/>
+            <w:right w:w="80" w:type="dxa"/>
+          </w:tblCellMar>
         </w:tblPrEx>
         <w:tc>
           <w:tcPr>
@@ -13463,6 +13509,12 @@
             <w:insideH w:val="none" w:color="auto" w:sz="0" w:space="0"/>
             <w:insideV w:val="none" w:color="auto" w:sz="0" w:space="0"/>
           </w:tblBorders>
+          <w:tblCellMar>
+            <w:top w:w="70" w:type="dxa"/>
+            <w:left w:w="80" w:type="dxa"/>
+            <w:bottom w:w="70" w:type="dxa"/>
+            <w:right w:w="80" w:type="dxa"/>
+          </w:tblCellMar>
         </w:tblPrEx>
         <w:tc>
           <w:tcPr>
@@ -13556,113 +13608,6 @@
                 <w:szCs w:val="20"/>
               </w:rPr>
               <w:t>209.71 ± 2.35</w:t>
-            </w:r>
-          </w:p>
-        </w:tc>
-      </w:tr>
-      <w:tr>
-        <w:tblPrEx>
-          <w:tblBorders>
-            <w:top w:val="single" w:color="000000" w:sz="12" w:space="0"/>
-            <w:left w:val="none" w:color="auto" w:sz="0" w:space="0"/>
-            <w:bottom w:val="single" w:color="000000" w:sz="12" w:space="0"/>
-            <w:right w:val="none" w:color="auto" w:sz="0" w:space="0"/>
-            <w:insideH w:val="none" w:color="auto" w:sz="0" w:space="0"/>
-            <w:insideV w:val="none" w:color="auto" w:sz="0" w:space="0"/>
-          </w:tblBorders>
-        </w:tblPrEx>
-        <w:tc>
-          <w:tcPr>
-            <w:tcW w:w="1872" w:type="dxa"/>
-            <w:vAlign w:val="center"/>
-          </w:tcPr>
-          <w:p>
-            <w:pPr>
-              <w:pStyle w:val="15"/>
-              <w:spacing w:before="0" w:after="0" w:line="240" w:lineRule="auto"/>
-            </w:pPr>
-            <w:r>
-              <w:rPr>
-                <w:sz w:val="20"/>
-                <w:szCs w:val="20"/>
-              </w:rPr>
-              <w:t>Rg (nm)</w:t>
-            </w:r>
-          </w:p>
-        </w:tc>
-        <w:tc>
-          <w:tcPr>
-            <w:tcW w:w="1872" w:type="dxa"/>
-            <w:vAlign w:val="center"/>
-          </w:tcPr>
-          <w:p>
-            <w:pPr>
-              <w:pStyle w:val="15"/>
-              <w:spacing w:before="0" w:after="0" w:line="240" w:lineRule="auto"/>
-            </w:pPr>
-            <w:r>
-              <w:rPr>
-                <w:sz w:val="20"/>
-                <w:szCs w:val="20"/>
-              </w:rPr>
-              <w:t>2.3045 ± 0.0056</w:t>
-            </w:r>
-          </w:p>
-        </w:tc>
-        <w:tc>
-          <w:tcPr>
-            <w:tcW w:w="1872" w:type="dxa"/>
-            <w:vAlign w:val="center"/>
-          </w:tcPr>
-          <w:p>
-            <w:pPr>
-              <w:pStyle w:val="15"/>
-              <w:spacing w:before="0" w:after="0" w:line="240" w:lineRule="auto"/>
-            </w:pPr>
-            <w:r>
-              <w:rPr>
-                <w:sz w:val="20"/>
-                <w:szCs w:val="20"/>
-              </w:rPr>
-              <w:t>2.3107 ± 0.0052</w:t>
-            </w:r>
-          </w:p>
-        </w:tc>
-        <w:tc>
-          <w:tcPr>
-            <w:tcW w:w="1872" w:type="dxa"/>
-            <w:vAlign w:val="center"/>
-          </w:tcPr>
-          <w:p>
-            <w:pPr>
-              <w:pStyle w:val="15"/>
-              <w:spacing w:before="0" w:after="0" w:line="240" w:lineRule="auto"/>
-            </w:pPr>
-            <w:r>
-              <w:rPr>
-                <w:sz w:val="20"/>
-                <w:szCs w:val="20"/>
-              </w:rPr>
-              <w:t>2.2967 ± 0.0047</w:t>
-            </w:r>
-          </w:p>
-        </w:tc>
-        <w:tc>
-          <w:tcPr>
-            <w:tcW w:w="1872" w:type="dxa"/>
-            <w:vAlign w:val="center"/>
-          </w:tcPr>
-          <w:p>
-            <w:pPr>
-              <w:pStyle w:val="15"/>
-              <w:spacing w:before="0" w:after="0" w:line="240" w:lineRule="auto"/>
-            </w:pPr>
-            <w:r>
-              <w:rPr>
-                <w:sz w:val="20"/>
-                <w:szCs w:val="20"/>
-              </w:rPr>
-              <w:t>2.3028 ± 0.0051</w:t>
             </w:r>
           </w:p>
         </w:tc>
@@ -13699,7 +13644,7 @@
                 <w:sz w:val="20"/>
                 <w:szCs w:val="20"/>
               </w:rPr>
-              <w:t>Intermolecular H-bonds</w:t>
+              <w:t>Rg (nm)</w:t>
             </w:r>
           </w:p>
         </w:tc>
@@ -13718,7 +13663,7 @@
                 <w:sz w:val="20"/>
                 <w:szCs w:val="20"/>
               </w:rPr>
-              <w:t>—</w:t>
+              <w:t>2.3045 ± 0.0056</w:t>
             </w:r>
           </w:p>
         </w:tc>
@@ -13737,7 +13682,7 @@
                 <w:sz w:val="20"/>
                 <w:szCs w:val="20"/>
               </w:rPr>
-              <w:t>2.19 ± 0.80</w:t>
+              <w:t>2.3107 ± 0.0052</w:t>
             </w:r>
           </w:p>
         </w:tc>
@@ -13756,7 +13701,7 @@
                 <w:sz w:val="20"/>
                 <w:szCs w:val="20"/>
               </w:rPr>
-              <w:t>7.03 ± 1.28</w:t>
+              <w:t>2.2967 ± 0.0047</w:t>
             </w:r>
           </w:p>
         </w:tc>
@@ -13775,7 +13720,7 @@
                 <w:sz w:val="20"/>
                 <w:szCs w:val="20"/>
               </w:rPr>
-              <w:t>2.93 ± 1.14</w:t>
+              <w:t>2.3028 ± 0.0051</w:t>
             </w:r>
           </w:p>
         </w:tc>
@@ -13790,6 +13735,125 @@
             <w:insideH w:val="none" w:color="auto" w:sz="0" w:space="0"/>
             <w:insideV w:val="none" w:color="auto" w:sz="0" w:space="0"/>
           </w:tblBorders>
+          <w:tblCellMar>
+            <w:top w:w="70" w:type="dxa"/>
+            <w:left w:w="80" w:type="dxa"/>
+            <w:bottom w:w="70" w:type="dxa"/>
+            <w:right w:w="80" w:type="dxa"/>
+          </w:tblCellMar>
+        </w:tblPrEx>
+        <w:tc>
+          <w:tcPr>
+            <w:tcW w:w="1872" w:type="dxa"/>
+            <w:vAlign w:val="center"/>
+          </w:tcPr>
+          <w:p>
+            <w:pPr>
+              <w:pStyle w:val="15"/>
+              <w:spacing w:before="0" w:after="0" w:line="240" w:lineRule="auto"/>
+            </w:pPr>
+            <w:r>
+              <w:rPr>
+                <w:sz w:val="20"/>
+                <w:szCs w:val="20"/>
+              </w:rPr>
+              <w:t>Intermolecular H-bonds</w:t>
+            </w:r>
+          </w:p>
+        </w:tc>
+        <w:tc>
+          <w:tcPr>
+            <w:tcW w:w="1872" w:type="dxa"/>
+            <w:vAlign w:val="center"/>
+          </w:tcPr>
+          <w:p>
+            <w:pPr>
+              <w:pStyle w:val="15"/>
+              <w:spacing w:before="0" w:after="0" w:line="240" w:lineRule="auto"/>
+            </w:pPr>
+            <w:r>
+              <w:rPr>
+                <w:sz w:val="20"/>
+                <w:szCs w:val="20"/>
+              </w:rPr>
+              <w:t>—</w:t>
+            </w:r>
+          </w:p>
+        </w:tc>
+        <w:tc>
+          <w:tcPr>
+            <w:tcW w:w="1872" w:type="dxa"/>
+            <w:vAlign w:val="center"/>
+          </w:tcPr>
+          <w:p>
+            <w:pPr>
+              <w:pStyle w:val="15"/>
+              <w:spacing w:before="0" w:after="0" w:line="240" w:lineRule="auto"/>
+            </w:pPr>
+            <w:r>
+              <w:rPr>
+                <w:sz w:val="20"/>
+                <w:szCs w:val="20"/>
+              </w:rPr>
+              <w:t>2.19 ± 0.80</w:t>
+            </w:r>
+          </w:p>
+        </w:tc>
+        <w:tc>
+          <w:tcPr>
+            <w:tcW w:w="1872" w:type="dxa"/>
+            <w:vAlign w:val="center"/>
+          </w:tcPr>
+          <w:p>
+            <w:pPr>
+              <w:pStyle w:val="15"/>
+              <w:spacing w:before="0" w:after="0" w:line="240" w:lineRule="auto"/>
+            </w:pPr>
+            <w:r>
+              <w:rPr>
+                <w:sz w:val="20"/>
+                <w:szCs w:val="20"/>
+              </w:rPr>
+              <w:t>7.03 ± 1.28</w:t>
+            </w:r>
+          </w:p>
+        </w:tc>
+        <w:tc>
+          <w:tcPr>
+            <w:tcW w:w="1872" w:type="dxa"/>
+            <w:vAlign w:val="center"/>
+          </w:tcPr>
+          <w:p>
+            <w:pPr>
+              <w:pStyle w:val="15"/>
+              <w:spacing w:before="0" w:after="0" w:line="240" w:lineRule="auto"/>
+            </w:pPr>
+            <w:r>
+              <w:rPr>
+                <w:sz w:val="20"/>
+                <w:szCs w:val="20"/>
+              </w:rPr>
+              <w:t>2.93 ± 1.14</w:t>
+            </w:r>
+          </w:p>
+        </w:tc>
+      </w:tr>
+      <w:tr>
+        <w:tblPrEx>
+          <w:tblBorders>
+            <w:top w:val="single" w:color="000000" w:sz="12" w:space="0"/>
+            <w:left w:val="none" w:color="auto" w:sz="0" w:space="0"/>
+            <w:bottom w:val="single" w:color="000000" w:sz="12" w:space="0"/>
+            <w:right w:val="none" w:color="auto" w:sz="0" w:space="0"/>
+            <w:insideH w:val="none" w:color="auto" w:sz="0" w:space="0"/>
+            <w:insideV w:val="none" w:color="auto" w:sz="0" w:space="0"/>
+          </w:tblBorders>
+          <w:tblCellMar>
+            <w:top w:w="70" w:type="dxa"/>
+            <w:left w:w="80" w:type="dxa"/>
+            <w:bottom w:w="70" w:type="dxa"/>
+            <w:right w:w="80" w:type="dxa"/>
+          </w:tblCellMar>
         </w:tblPrEx>
         <w:tc>
           <w:tcPr>

</xml_diff>